<commit_message>
EA2: limpieza + enriquecimiento + EDA + grÃ¡ficos
</commit_message>
<xml_diff>
--- a/docs/Sanchez_Usuga_Eder_David__E1.docx
+++ b/docs/Sanchez_Usuga_Eder_David__E1.docx
@@ -24,7 +24,15 @@
           <w:bCs/>
           <w:lang w:val="es-CO" w:bidi="ar-SA"/>
         </w:rPr>
-        <w:t>Evidencia de aprendizaje No. 1</w:t>
+        <w:t xml:space="preserve">Evidencia de aprendizaje No. </w:t>
+      </w:r>
+      <w:r>
+        <w:rPr>
+          <w:b/>
+          <w:bCs/>
+          <w:lang w:val="es-CO" w:bidi="ar-SA"/>
+        </w:rPr>
+        <w:t>2</w:t>
       </w:r>
     </w:p>
     <w:p>
@@ -54,7 +62,7 @@
         <w:rPr>
           <w:lang w:val="es-CO" w:bidi="ar-SA"/>
         </w:rPr>
-        <w:t>Formulación de una necesidad de ingeniería de datos</w:t>
+        <w:t>Análisis de una necesidad de ingeniería de datos</w:t>
       </w:r>
     </w:p>
     <w:p>
@@ -423,7 +431,7 @@
           <w:r>
             <w:fldChar w:fldCharType="separate"/>
           </w:r>
-          <w:hyperlink w:anchor="_Toc213571302" w:history="1">
+          <w:hyperlink w:anchor="_Toc214742812" w:history="1">
             <w:r>
               <w:rPr>
                 <w:rStyle w:val="Hipervnculo"/>
@@ -450,7 +458,7 @@
                 <w:noProof/>
                 <w:webHidden/>
               </w:rPr>
-              <w:instrText xml:space="preserve"> PAGEREF _Toc213571302 \h </w:instrText>
+              <w:instrText xml:space="preserve"> PAGEREF _Toc214742812 \h </w:instrText>
             </w:r>
             <w:r>
               <w:rPr>
@@ -496,7 +504,7 @@
               <w14:ligatures w14:val="standardContextual"/>
             </w:rPr>
           </w:pPr>
-          <w:hyperlink w:anchor="_Toc213571303" w:history="1">
+          <w:hyperlink w:anchor="_Toc214742813" w:history="1">
             <w:r>
               <w:rPr>
                 <w:rStyle w:val="Hipervnculo"/>
@@ -523,7 +531,7 @@
                 <w:noProof/>
                 <w:webHidden/>
               </w:rPr>
-              <w:instrText xml:space="preserve"> PAGEREF _Toc213571303 \h </w:instrText>
+              <w:instrText xml:space="preserve"> PAGEREF _Toc214742813 \h </w:instrText>
             </w:r>
             <w:r>
               <w:rPr>
@@ -569,7 +577,7 @@
               <w14:ligatures w14:val="standardContextual"/>
             </w:rPr>
           </w:pPr>
-          <w:hyperlink w:anchor="_Toc213571304" w:history="1">
+          <w:hyperlink w:anchor="_Toc214742814" w:history="1">
             <w:r>
               <w:rPr>
                 <w:rStyle w:val="Hipervnculo"/>
@@ -596,7 +604,7 @@
                 <w:noProof/>
                 <w:webHidden/>
               </w:rPr>
-              <w:instrText xml:space="preserve"> PAGEREF _Toc213571304 \h </w:instrText>
+              <w:instrText xml:space="preserve"> PAGEREF _Toc214742814 \h </w:instrText>
             </w:r>
             <w:r>
               <w:rPr>
@@ -642,7 +650,7 @@
               <w14:ligatures w14:val="standardContextual"/>
             </w:rPr>
           </w:pPr>
-          <w:hyperlink w:anchor="_Toc213571305" w:history="1">
+          <w:hyperlink w:anchor="_Toc214742815" w:history="1">
             <w:r>
               <w:rPr>
                 <w:rStyle w:val="Hipervnculo"/>
@@ -669,226 +677,7 @@
                 <w:noProof/>
                 <w:webHidden/>
               </w:rPr>
-              <w:instrText xml:space="preserve"> PAGEREF _Toc213571305 \h </w:instrText>
-            </w:r>
-            <w:r>
-              <w:rPr>
-                <w:noProof/>
-                <w:webHidden/>
-              </w:rPr>
-            </w:r>
-            <w:r>
-              <w:rPr>
-                <w:noProof/>
-                <w:webHidden/>
-              </w:rPr>
-              <w:fldChar w:fldCharType="separate"/>
-            </w:r>
-            <w:r>
-              <w:rPr>
-                <w:noProof/>
-                <w:webHidden/>
-              </w:rPr>
-              <w:t>5</w:t>
-            </w:r>
-            <w:r>
-              <w:rPr>
-                <w:noProof/>
-                <w:webHidden/>
-              </w:rPr>
-              <w:fldChar w:fldCharType="end"/>
-            </w:r>
-          </w:hyperlink>
-        </w:p>
-        <w:p>
-          <w:pPr>
-            <w:pStyle w:val="TDC2"/>
-            <w:tabs>
-              <w:tab w:val="right" w:leader="dot" w:pos="8828"/>
-            </w:tabs>
-            <w:rPr>
-              <w:rFonts w:cstheme="minorBidi"/>
-              <w:noProof/>
-              <w:kern w:val="2"/>
-              <w:sz w:val="24"/>
-              <w:szCs w:val="24"/>
-              <w14:ligatures w14:val="standardContextual"/>
-            </w:rPr>
-          </w:pPr>
-          <w:hyperlink w:anchor="_Toc213571306" w:history="1">
-            <w:r>
-              <w:rPr>
-                <w:rStyle w:val="Hipervnculo"/>
-                <w:noProof/>
-              </w:rPr>
-              <w:t>Etapa 1:</w:t>
-            </w:r>
-            <w:r>
-              <w:rPr>
-                <w:noProof/>
-                <w:webHidden/>
-              </w:rPr>
-              <w:tab/>
-            </w:r>
-            <w:r>
-              <w:rPr>
-                <w:noProof/>
-                <w:webHidden/>
-              </w:rPr>
-              <w:fldChar w:fldCharType="begin"/>
-            </w:r>
-            <w:r>
-              <w:rPr>
-                <w:noProof/>
-                <w:webHidden/>
-              </w:rPr>
-              <w:instrText xml:space="preserve"> PAGEREF _Toc213571306 \h </w:instrText>
-            </w:r>
-            <w:r>
-              <w:rPr>
-                <w:noProof/>
-                <w:webHidden/>
-              </w:rPr>
-            </w:r>
-            <w:r>
-              <w:rPr>
-                <w:noProof/>
-                <w:webHidden/>
-              </w:rPr>
-              <w:fldChar w:fldCharType="separate"/>
-            </w:r>
-            <w:r>
-              <w:rPr>
-                <w:noProof/>
-                <w:webHidden/>
-              </w:rPr>
-              <w:t>5</w:t>
-            </w:r>
-            <w:r>
-              <w:rPr>
-                <w:noProof/>
-                <w:webHidden/>
-              </w:rPr>
-              <w:fldChar w:fldCharType="end"/>
-            </w:r>
-          </w:hyperlink>
-        </w:p>
-        <w:p>
-          <w:pPr>
-            <w:pStyle w:val="TDC2"/>
-            <w:tabs>
-              <w:tab w:val="right" w:leader="dot" w:pos="8828"/>
-            </w:tabs>
-            <w:rPr>
-              <w:rFonts w:cstheme="minorBidi"/>
-              <w:noProof/>
-              <w:kern w:val="2"/>
-              <w:sz w:val="24"/>
-              <w:szCs w:val="24"/>
-              <w14:ligatures w14:val="standardContextual"/>
-            </w:rPr>
-          </w:pPr>
-          <w:hyperlink w:anchor="_Toc213571307" w:history="1">
-            <w:r>
-              <w:rPr>
-                <w:rStyle w:val="Hipervnculo"/>
-                <w:noProof/>
-              </w:rPr>
-              <w:t>Etapa 2:</w:t>
-            </w:r>
-            <w:r>
-              <w:rPr>
-                <w:noProof/>
-                <w:webHidden/>
-              </w:rPr>
-              <w:tab/>
-            </w:r>
-            <w:r>
-              <w:rPr>
-                <w:noProof/>
-                <w:webHidden/>
-              </w:rPr>
-              <w:fldChar w:fldCharType="begin"/>
-            </w:r>
-            <w:r>
-              <w:rPr>
-                <w:noProof/>
-                <w:webHidden/>
-              </w:rPr>
-              <w:instrText xml:space="preserve"> PAGEREF _Toc213571307 \h </w:instrText>
-            </w:r>
-            <w:r>
-              <w:rPr>
-                <w:noProof/>
-                <w:webHidden/>
-              </w:rPr>
-            </w:r>
-            <w:r>
-              <w:rPr>
-                <w:noProof/>
-                <w:webHidden/>
-              </w:rPr>
-              <w:fldChar w:fldCharType="separate"/>
-            </w:r>
-            <w:r>
-              <w:rPr>
-                <w:noProof/>
-                <w:webHidden/>
-              </w:rPr>
-              <w:t>5</w:t>
-            </w:r>
-            <w:r>
-              <w:rPr>
-                <w:noProof/>
-                <w:webHidden/>
-              </w:rPr>
-              <w:fldChar w:fldCharType="end"/>
-            </w:r>
-          </w:hyperlink>
-        </w:p>
-        <w:p>
-          <w:pPr>
-            <w:pStyle w:val="TDC2"/>
-            <w:tabs>
-              <w:tab w:val="right" w:leader="dot" w:pos="8828"/>
-            </w:tabs>
-            <w:rPr>
-              <w:rFonts w:cstheme="minorBidi"/>
-              <w:noProof/>
-              <w:kern w:val="2"/>
-              <w:sz w:val="24"/>
-              <w:szCs w:val="24"/>
-              <w14:ligatures w14:val="standardContextual"/>
-            </w:rPr>
-          </w:pPr>
-          <w:hyperlink w:anchor="_Toc213571308" w:history="1">
-            <w:r>
-              <w:rPr>
-                <w:rStyle w:val="Hipervnculo"/>
-                <w:noProof/>
-              </w:rPr>
-              <w:t>Etapa 3:</w:t>
-            </w:r>
-            <w:r>
-              <w:rPr>
-                <w:noProof/>
-                <w:webHidden/>
-              </w:rPr>
-              <w:tab/>
-            </w:r>
-            <w:r>
-              <w:rPr>
-                <w:noProof/>
-                <w:webHidden/>
-              </w:rPr>
-              <w:fldChar w:fldCharType="begin"/>
-            </w:r>
-            <w:r>
-              <w:rPr>
-                <w:noProof/>
-                <w:webHidden/>
-              </w:rPr>
-              <w:instrText xml:space="preserve"> PAGEREF _Toc213571308 \h </w:instrText>
+              <w:instrText xml:space="preserve"> PAGEREF _Toc214742815 \h </w:instrText>
             </w:r>
             <w:r>
               <w:rPr>
@@ -934,7 +723,7 @@
               <w14:ligatures w14:val="standardContextual"/>
             </w:rPr>
           </w:pPr>
-          <w:hyperlink w:anchor="_Toc213571309" w:history="1">
+          <w:hyperlink w:anchor="_Toc214742816" w:history="1">
             <w:r>
               <w:rPr>
                 <w:rStyle w:val="Hipervnculo"/>
@@ -961,7 +750,7 @@
                 <w:noProof/>
                 <w:webHidden/>
               </w:rPr>
-              <w:instrText xml:space="preserve"> PAGEREF _Toc213571309 \h </w:instrText>
+              <w:instrText xml:space="preserve"> PAGEREF _Toc214742816 \h </w:instrText>
             </w:r>
             <w:r>
               <w:rPr>
@@ -1007,7 +796,7 @@
               <w14:ligatures w14:val="standardContextual"/>
             </w:rPr>
           </w:pPr>
-          <w:hyperlink w:anchor="_Toc213571310" w:history="1">
+          <w:hyperlink w:anchor="_Toc214742817" w:history="1">
             <w:r>
               <w:rPr>
                 <w:rStyle w:val="Hipervnculo"/>
@@ -1035,7 +824,7 @@
                 <w:noProof/>
                 <w:webHidden/>
               </w:rPr>
-              <w:instrText xml:space="preserve"> PAGEREF _Toc213571310 \h </w:instrText>
+              <w:instrText xml:space="preserve"> PAGEREF _Toc214742817 \h </w:instrText>
             </w:r>
             <w:r>
               <w:rPr>
@@ -1100,7 +889,7 @@
           <w:lang w:val="es-CO" w:bidi="ar-SA"/>
         </w:rPr>
       </w:pPr>
-      <w:bookmarkStart w:id="0" w:name="_Toc213571302"/>
+      <w:bookmarkStart w:id="0" w:name="_Toc214742812"/>
       <w:r>
         <w:rPr>
           <w:lang w:val="es-CO" w:bidi="ar-SA"/>
@@ -1135,13 +924,69 @@
         <w:rPr>
           <w:lang w:val="es-CO" w:bidi="ar-SA"/>
         </w:rPr>
-        <w:t xml:space="preserve">Este trabajo formula un caso de uso real de ingeniería de datos a partir del conjunto de datos públicos “Incidentes viales” de la Alcaldía de Medellín. El objetivo general es priorizar puntos críticos de siniestralidad para orientar intervenciones de seguridad vial (señalización, control y campañas). La metodología propuesta contempla la selección y revisión de la fuente, la construcción de un repositorio con control de versiones, el diseño de un esquema de almacenamiento local en SQLite y la evidencia del flujo de datos desde el </w:t>
+        <w:t>La ciudad de Medellín necesita priorizar intervenciones de seguridad vial basadas en evidencia para reducir la siniestralidad. Este proyecto toma como fuente el conjunto de datos públicos “Incidentes viales” de la Secretaría de Movilidad (datos abiertos), que contiene variables como fecha y hora del incidente, clase de accidente (choque, atropello, volcamiento, etc.), gravedad (solo daños, herido, muerto), comuna/</w:t>
       </w:r>
       <w:proofErr w:type="spellStart"/>
       <w:r>
         <w:rPr>
           <w:lang w:val="es-CO" w:bidi="ar-SA"/>
         </w:rPr>
+        <w:t>numcomuna</w:t>
+      </w:r>
+      <w:proofErr w:type="spellEnd"/>
+      <w:r>
+        <w:rPr>
+          <w:lang w:val="es-CO" w:bidi="ar-SA"/>
+        </w:rPr>
+        <w:t>, barrio, dirección, diseño vial e X/Y en sistema MAGNA Medellín.</w:t>
+      </w:r>
+    </w:p>
+    <w:p>
+      <w:pPr>
+        <w:jc w:val="both"/>
+        <w:rPr>
+          <w:lang w:val="es-CO" w:bidi="ar-SA"/>
+        </w:rPr>
+      </w:pPr>
+      <w:r>
+        <w:rPr>
+          <w:lang w:val="es-CO" w:bidi="ar-SA"/>
+        </w:rPr>
+        <w:t xml:space="preserve">El trabajo cargará la información en una base SQLite versionada en GitHub; analizará la calidad de los datos; explorará patrones temporales y territoriales; medirá indicadores por comuna, franja horaria y clase; entenderá relaciones entre variables clave; y mostrará resultados mediante visualizaciones y un </w:t>
+      </w:r>
+      <w:proofErr w:type="spellStart"/>
+      <w:r>
+        <w:rPr>
+          <w:lang w:val="es-CO" w:bidi="ar-SA"/>
+        </w:rPr>
+        <w:t>dashboard</w:t>
+      </w:r>
+      <w:proofErr w:type="spellEnd"/>
+      <w:r>
+        <w:rPr>
+          <w:lang w:val="es-CO" w:bidi="ar-SA"/>
+        </w:rPr>
+        <w:t xml:space="preserve"> interactivo. Cuando falte la fecha, se imputará de forma controlada (rango 2022–2024, semilla fija) para garantizar coherencia temporal.</w:t>
+      </w:r>
+    </w:p>
+    <w:p>
+      <w:pPr>
+        <w:jc w:val="both"/>
+        <w:rPr>
+          <w:lang w:val="es-CO" w:bidi="ar-SA"/>
+        </w:rPr>
+      </w:pPr>
+      <w:r>
+        <w:rPr>
+          <w:lang w:val="es-CO" w:bidi="ar-SA"/>
+        </w:rPr>
+        <w:t xml:space="preserve">Lo anterior permitirá identificar y priorizar puntos críticos y franjas horarias para orientar señalización, control y campañas. Como resultado, se entregará un </w:t>
+      </w:r>
+      <w:proofErr w:type="spellStart"/>
+      <w:r>
+        <w:rPr>
+          <w:lang w:val="es-CO" w:bidi="ar-SA"/>
+        </w:rPr>
         <w:t>dataset</w:t>
       </w:r>
       <w:proofErr w:type="spellEnd"/>
@@ -1149,17 +994,94 @@
         <w:rPr>
           <w:lang w:val="es-CO" w:bidi="ar-SA"/>
         </w:rPr>
-        <w:t xml:space="preserve"> original hasta una exportación a CSV. Para la etapa 1, se documentan el contexto, objetivos, variables clave y la planificación mediante un diagrama de Gantt. Las etapas posteriores incluirán el modelado detallado, limpieza y enriquecimiento de datos, así como la generación de indicadores por comuna, franja horaria y clase de incidente. Se espera que los resultados apoyen la toma de decisiones con criterios reproducibles y auditables, y sienten las bases para futuros modelos de análisis geoespacial o predicción de riesgo.</w:t>
-      </w:r>
-    </w:p>
-    <w:p>
-      <w:pPr>
-        <w:suppressAutoHyphens w:val="0"/>
-        <w:spacing w:after="160" w:line="259" w:lineRule="auto"/>
-        <w:rPr>
-          <w:lang w:val="es-CO" w:bidi="ar-SA"/>
-        </w:rPr>
-      </w:pPr>
+        <w:t xml:space="preserve"> enriquecido (data/dataset_enriquecido.csv), la </w:t>
+      </w:r>
+      <w:proofErr w:type="gramStart"/>
+      <w:r>
+        <w:rPr>
+          <w:lang w:val="es-CO" w:bidi="ar-SA"/>
+        </w:rPr>
+        <w:t xml:space="preserve">tabla </w:t>
+      </w:r>
+      <w:proofErr w:type="spellStart"/>
+      <w:r>
+        <w:rPr>
+          <w:lang w:val="es-CO" w:bidi="ar-SA"/>
+        </w:rPr>
+        <w:t>incidentes</w:t>
+      </w:r>
+      <w:proofErr w:type="gramEnd"/>
+      <w:r>
+        <w:rPr>
+          <w:lang w:val="es-CO" w:bidi="ar-SA"/>
+        </w:rPr>
+        <w:t>_enriquecido</w:t>
+      </w:r>
+      <w:proofErr w:type="spellEnd"/>
+      <w:r>
+        <w:rPr>
+          <w:lang w:val="es-CO" w:bidi="ar-SA"/>
+        </w:rPr>
+        <w:t xml:space="preserve"> en SQLite, un conjunto de gráficos explicativos y un </w:t>
+      </w:r>
+      <w:proofErr w:type="spellStart"/>
+      <w:r>
+        <w:rPr>
+          <w:lang w:val="es-CO" w:bidi="ar-SA"/>
+        </w:rPr>
+        <w:t>dashboard</w:t>
+      </w:r>
+      <w:proofErr w:type="spellEnd"/>
+      <w:r>
+        <w:rPr>
+          <w:lang w:val="es-CO" w:bidi="ar-SA"/>
+        </w:rPr>
+        <w:t xml:space="preserve"> con hallazgos accionables, todo documentado en formato APA y organizado en el repositorio.</w:t>
+      </w:r>
+    </w:p>
+    <w:p>
+      <w:pPr>
+        <w:jc w:val="both"/>
+        <w:rPr>
+          <w:lang w:val="es-CO" w:bidi="ar-SA"/>
+        </w:rPr>
+      </w:pPr>
+    </w:p>
+    <w:p>
+      <w:pPr>
+        <w:jc w:val="both"/>
+        <w:rPr>
+          <w:lang w:val="es-CO" w:bidi="ar-SA"/>
+        </w:rPr>
+      </w:pPr>
+      <w:r>
+        <w:rPr>
+          <w:b/>
+          <w:bCs/>
+          <w:lang w:val="es-CO" w:bidi="ar-SA"/>
+        </w:rPr>
+        <w:t>Palabras clave:</w:t>
+      </w:r>
+      <w:r>
+        <w:rPr>
+          <w:lang w:val="es-CO" w:bidi="ar-SA"/>
+        </w:rPr>
+        <w:t xml:space="preserve"> seguridad vial; incidentes de tránsito; Medellín; datos abiertos; SQLite; análisis descriptivo; series temporales; priorización territorial; </w:t>
+      </w:r>
+      <w:proofErr w:type="spellStart"/>
+      <w:r>
+        <w:rPr>
+          <w:lang w:val="es-CO" w:bidi="ar-SA"/>
+        </w:rPr>
+        <w:t>dashboard</w:t>
+      </w:r>
+      <w:proofErr w:type="spellEnd"/>
+      <w:r>
+        <w:rPr>
+          <w:lang w:val="es-CO" w:bidi="ar-SA"/>
+        </w:rPr>
+        <w:t>.</w:t>
+      </w:r>
       <w:r>
         <w:rPr>
           <w:lang w:val="es-CO" w:bidi="ar-SA"/>
@@ -1174,7 +1096,7 @@
           <w:lang w:val="es-CO" w:bidi="ar-SA"/>
         </w:rPr>
       </w:pPr>
-      <w:bookmarkStart w:id="1" w:name="_Toc213571303"/>
+      <w:bookmarkStart w:id="1" w:name="_Toc214742813"/>
       <w:r>
         <w:rPr>
           <w:lang w:val="es-CO" w:bidi="ar-SA"/>
@@ -1194,13 +1116,27 @@
         <w:rPr>
           <w:lang w:val="es-CO" w:bidi="ar-SA"/>
         </w:rPr>
-        <w:t xml:space="preserve">Priorizar segmentos y zonas urbanas de Medellín con mayor siniestralidad vial para soportar decisiones de intervención y prevención, utilizando el </w:t>
+        <w:t xml:space="preserve">Diseñar, desarrollar y desplegar un pipeline de ingeniería de datos y Deep </w:t>
       </w:r>
       <w:proofErr w:type="spellStart"/>
       <w:r>
         <w:rPr>
           <w:lang w:val="es-CO" w:bidi="ar-SA"/>
         </w:rPr>
+        <w:t>Learning</w:t>
+      </w:r>
+      <w:proofErr w:type="spellEnd"/>
+      <w:r>
+        <w:rPr>
+          <w:lang w:val="es-CO" w:bidi="ar-SA"/>
+        </w:rPr>
+        <w:t xml:space="preserve"> que cargue, limpie, normalice, enriquezca, analice y muestre el </w:t>
+      </w:r>
+      <w:proofErr w:type="spellStart"/>
+      <w:r>
+        <w:rPr>
+          <w:lang w:val="es-CO" w:bidi="ar-SA"/>
+        </w:rPr>
         <w:t>dataset</w:t>
       </w:r>
       <w:proofErr w:type="spellEnd"/>
@@ -1208,15 +1144,8 @@
         <w:rPr>
           <w:lang w:val="es-CO" w:bidi="ar-SA"/>
         </w:rPr>
-        <w:t xml:space="preserve"> público “Incidentes viales” y una base de datos local en SQLite.</w:t>
-      </w:r>
-    </w:p>
-    <w:p>
-      <w:pPr>
-        <w:rPr>
-          <w:lang w:val="es-CO" w:bidi="ar-SA"/>
-        </w:rPr>
-      </w:pPr>
+        <w:t xml:space="preserve"> “Incidentes viales” en SQLite, y que genere indicadores, visualizaciones y un modelo para priorizar puntos críticos y franjas horarias de siniestralidad en Medellín.</w:t>
+      </w:r>
     </w:p>
     <w:p>
       <w:pPr>
@@ -1225,7 +1154,7 @@
           <w:lang w:val="es-CO" w:bidi="ar-SA"/>
         </w:rPr>
       </w:pPr>
-      <w:bookmarkStart w:id="2" w:name="_Toc213571304"/>
+      <w:bookmarkStart w:id="2" w:name="_Toc214742814"/>
       <w:r>
         <w:rPr>
           <w:lang w:val="es-CO" w:bidi="ar-SA"/>
@@ -1239,17 +1168,25 @@
         <w:pStyle w:val="Prrafodelista"/>
         <w:numPr>
           <w:ilvl w:val="0"/>
-          <w:numId w:val="9"/>
+          <w:numId w:val="10"/>
         </w:numPr>
         <w:rPr>
           <w:lang w:val="es-CO" w:bidi="ar-SA"/>
         </w:rPr>
       </w:pPr>
-      <w:r>
-        <w:rPr>
-          <w:lang w:val="es-CO" w:bidi="ar-SA"/>
-        </w:rPr>
-        <w:t>Seleccionar y documentar la fuente de datos, su licencia y variables principales.</w:t>
+      <w:proofErr w:type="spellStart"/>
+      <w:r>
+        <w:rPr>
+          <w:lang w:val="es-CO" w:bidi="ar-SA"/>
+        </w:rPr>
+        <w:t>Ingestar</w:t>
+      </w:r>
+      <w:proofErr w:type="spellEnd"/>
+      <w:r>
+        <w:rPr>
+          <w:lang w:val="es-CO" w:bidi="ar-SA"/>
+        </w:rPr>
+        <w:t xml:space="preserve"> y documentar la fuente (origen, licencia, variables) con trazabilidad en GitHub.</w:t>
       </w:r>
     </w:p>
     <w:p>
@@ -1257,17 +1194,63 @@
         <w:pStyle w:val="Prrafodelista"/>
         <w:numPr>
           <w:ilvl w:val="0"/>
-          <w:numId w:val="9"/>
+          <w:numId w:val="10"/>
         </w:numPr>
         <w:rPr>
-          <w:lang w:val="es-CO" w:bidi="ar-SA"/>
-        </w:rPr>
-      </w:pPr>
-      <w:r>
-        <w:rPr>
-          <w:lang w:val="es-CO" w:bidi="ar-SA"/>
-        </w:rPr>
-        <w:t>Diseñar un esquema relacional mínimo en SQLite que permita consultas por tiempo, geografía y clase de incidente.</w:t>
+          <w:rFonts w:hint="eastAsia"/>
+          <w:lang w:val="es-CO" w:bidi="ar-SA"/>
+        </w:rPr>
+      </w:pPr>
+      <w:r>
+        <w:rPr>
+          <w:rFonts w:hint="eastAsia"/>
+          <w:lang w:val="es-CO" w:bidi="ar-SA"/>
+        </w:rPr>
+        <w:t xml:space="preserve">Modelar y materializar el almacenamiento en SQLite y el flujo </w:t>
+      </w:r>
+      <w:proofErr w:type="spellStart"/>
+      <w:r>
+        <w:rPr>
+          <w:rFonts w:hint="eastAsia"/>
+          <w:lang w:val="es-CO" w:bidi="ar-SA"/>
+        </w:rPr>
+        <w:t>dataset</w:t>
+      </w:r>
+      <w:proofErr w:type="spellEnd"/>
+      <w:r>
+        <w:rPr>
+          <w:rFonts w:hint="eastAsia"/>
+          <w:lang w:val="es-CO" w:bidi="ar-SA"/>
+        </w:rPr>
+        <w:t xml:space="preserve"> </w:t>
+      </w:r>
+      <w:r>
+        <w:rPr>
+          <w:rFonts w:hint="eastAsia"/>
+          <w:lang w:val="es-CO" w:bidi="ar-SA"/>
+        </w:rPr>
+        <w:t>→</w:t>
+      </w:r>
+      <w:r>
+        <w:rPr>
+          <w:rFonts w:hint="eastAsia"/>
+          <w:lang w:val="es-CO" w:bidi="ar-SA"/>
+        </w:rPr>
+        <w:t xml:space="preserve"> SQLite </w:t>
+      </w:r>
+      <w:r>
+        <w:rPr>
+          <w:rFonts w:hint="eastAsia"/>
+          <w:lang w:val="es-CO" w:bidi="ar-SA"/>
+        </w:rPr>
+        <w:t>→</w:t>
+      </w:r>
+      <w:r>
+        <w:rPr>
+          <w:rFonts w:hint="eastAsia"/>
+          <w:lang w:val="es-CO" w:bidi="ar-SA"/>
+        </w:rPr>
+        <w:t xml:space="preserve"> CSV.</w:t>
       </w:r>
     </w:p>
     <w:p>
@@ -1275,7 +1258,7 @@
         <w:pStyle w:val="Prrafodelista"/>
         <w:numPr>
           <w:ilvl w:val="0"/>
-          <w:numId w:val="9"/>
+          <w:numId w:val="10"/>
         </w:numPr>
         <w:rPr>
           <w:lang w:val="es-CO" w:bidi="ar-SA"/>
@@ -1283,79 +1266,37 @@
       </w:pPr>
       <w:r>
         <w:rPr>
-          <w:rFonts w:hint="eastAsia"/>
-          <w:lang w:val="es-CO" w:bidi="ar-SA"/>
-        </w:rPr>
-        <w:t xml:space="preserve">Implementar el flujo de carga </w:t>
+          <w:lang w:val="es-CO" w:bidi="ar-SA"/>
+        </w:rPr>
+        <w:t xml:space="preserve">Limpiar y normalizar: </w:t>
       </w:r>
       <w:proofErr w:type="spellStart"/>
       <w:r>
         <w:rPr>
-          <w:rFonts w:hint="eastAsia"/>
-          <w:lang w:val="es-CO" w:bidi="ar-SA"/>
-        </w:rPr>
-        <w:t>dataset</w:t>
+          <w:lang w:val="es-CO" w:bidi="ar-SA"/>
+        </w:rPr>
+        <w:t>snake_case</w:t>
       </w:r>
       <w:proofErr w:type="spellEnd"/>
       <w:r>
         <w:rPr>
-          <w:rFonts w:hint="eastAsia"/>
-          <w:lang w:val="es-CO" w:bidi="ar-SA"/>
-        </w:rPr>
-        <w:t xml:space="preserve"> </w:t>
-      </w:r>
-      <w:r>
-        <w:rPr>
-          <w:rFonts w:hint="eastAsia"/>
-          <w:lang w:val="es-CO" w:bidi="ar-SA"/>
-        </w:rPr>
-        <w:t>→</w:t>
-      </w:r>
-      <w:r>
-        <w:rPr>
-          <w:rFonts w:hint="eastAsia"/>
-          <w:lang w:val="es-CO" w:bidi="ar-SA"/>
-        </w:rPr>
-        <w:t xml:space="preserve"> SQLite y la </w:t>
-      </w:r>
-      <w:r>
-        <w:rPr>
-          <w:lang w:val="es-CO" w:bidi="ar-SA"/>
-        </w:rPr>
-        <w:t>exportaci</w:t>
-      </w:r>
-      <w:r>
-        <w:rPr>
-          <w:lang w:val="es-CO" w:bidi="ar-SA"/>
-        </w:rPr>
-        <w:t>ó</w:t>
-      </w:r>
-      <w:r>
-        <w:rPr>
-          <w:lang w:val="es-CO" w:bidi="ar-SA"/>
-        </w:rPr>
-        <w:t>n</w:t>
-      </w:r>
-      <w:r>
-        <w:rPr>
-          <w:rFonts w:hint="eastAsia"/>
-          <w:lang w:val="es-CO" w:bidi="ar-SA"/>
-        </w:rPr>
-        <w:t xml:space="preserve"> SQLite </w:t>
-      </w:r>
-      <w:r>
-        <w:rPr>
-          <w:rFonts w:hint="eastAsia"/>
-          <w:lang w:val="es-CO" w:bidi="ar-SA"/>
-        </w:rPr>
-        <w:t>→</w:t>
-      </w:r>
-      <w:r>
-        <w:rPr>
-          <w:rFonts w:hint="eastAsia"/>
-          <w:lang w:val="es-CO" w:bidi="ar-SA"/>
-        </w:rPr>
-        <w:t xml:space="preserve"> CSV.</w:t>
+          <w:lang w:val="es-CO" w:bidi="ar-SA"/>
+        </w:rPr>
+        <w:t>, tipificación (</w:t>
+      </w:r>
+      <w:proofErr w:type="spellStart"/>
+      <w:r>
+        <w:rPr>
+          <w:lang w:val="es-CO" w:bidi="ar-SA"/>
+        </w:rPr>
+        <w:t>numcomuna</w:t>
+      </w:r>
+      <w:proofErr w:type="spellEnd"/>
+      <w:r>
+        <w:rPr>
+          <w:lang w:val="es-CO" w:bidi="ar-SA"/>
+        </w:rPr>
+        <w:t>, X, Y), tratamiento de nulos y duplicados.</w:t>
       </w:r>
     </w:p>
     <w:p>
@@ -1363,7 +1304,7 @@
         <w:pStyle w:val="Prrafodelista"/>
         <w:numPr>
           <w:ilvl w:val="0"/>
-          <w:numId w:val="9"/>
+          <w:numId w:val="10"/>
         </w:numPr>
         <w:rPr>
           <w:lang w:val="es-CO" w:bidi="ar-SA"/>
@@ -1373,7 +1314,49 @@
         <w:rPr>
           <w:lang w:val="es-CO" w:bidi="ar-SA"/>
         </w:rPr>
-        <w:t>Planificar la metodología con un diagrama de Gantt que incluya WBS, dependencias y entregables.</w:t>
+        <w:t xml:space="preserve">Enriquecer la dimensión temporal: derivar fecha/hora y crear año, mes, día, </w:t>
+      </w:r>
+      <w:proofErr w:type="spellStart"/>
+      <w:r>
+        <w:rPr>
+          <w:lang w:val="es-CO" w:bidi="ar-SA"/>
+        </w:rPr>
+        <w:t>anio_mes</w:t>
+      </w:r>
+      <w:proofErr w:type="spellEnd"/>
+      <w:r>
+        <w:rPr>
+          <w:lang w:val="es-CO" w:bidi="ar-SA"/>
+        </w:rPr>
+        <w:t xml:space="preserve">, </w:t>
+      </w:r>
+      <w:proofErr w:type="spellStart"/>
+      <w:r>
+        <w:rPr>
+          <w:lang w:val="es-CO" w:bidi="ar-SA"/>
+        </w:rPr>
+        <w:t>hora_num</w:t>
+      </w:r>
+      <w:proofErr w:type="spellEnd"/>
+      <w:r>
+        <w:rPr>
+          <w:lang w:val="es-CO" w:bidi="ar-SA"/>
+        </w:rPr>
+        <w:t xml:space="preserve">, </w:t>
+      </w:r>
+      <w:proofErr w:type="spellStart"/>
+      <w:r>
+        <w:rPr>
+          <w:lang w:val="es-CO" w:bidi="ar-SA"/>
+        </w:rPr>
+        <w:t>franja_horaria</w:t>
+      </w:r>
+      <w:proofErr w:type="spellEnd"/>
+      <w:r>
+        <w:rPr>
+          <w:lang w:val="es-CO" w:bidi="ar-SA"/>
+        </w:rPr>
+        <w:t xml:space="preserve"> (generar fecha cuando falte).</w:t>
       </w:r>
     </w:p>
     <w:p>
@@ -1381,7 +1364,7 @@
         <w:pStyle w:val="Prrafodelista"/>
         <w:numPr>
           <w:ilvl w:val="0"/>
-          <w:numId w:val="9"/>
+          <w:numId w:val="10"/>
         </w:numPr>
         <w:rPr>
           <w:lang w:val="es-CO" w:bidi="ar-SA"/>
@@ -1391,17 +1374,132 @@
         <w:rPr>
           <w:lang w:val="es-CO" w:bidi="ar-SA"/>
         </w:rPr>
-        <w:t>Dejar un README operativo con las instrucciones de reproducción y créditos.</w:t>
-      </w:r>
-    </w:p>
-    <w:p>
-      <w:pPr>
-        <w:suppressAutoHyphens w:val="0"/>
-        <w:spacing w:after="160" w:line="259" w:lineRule="auto"/>
-        <w:rPr>
-          <w:lang w:val="es-CO" w:bidi="ar-SA"/>
-        </w:rPr>
-      </w:pPr>
+        <w:t>Explorar, analizar, medir y entender las cinco variables clave con estadísticas y gráficos.</w:t>
+      </w:r>
+    </w:p>
+    <w:p>
+      <w:pPr>
+        <w:pStyle w:val="Prrafodelista"/>
+        <w:numPr>
+          <w:ilvl w:val="0"/>
+          <w:numId w:val="10"/>
+        </w:numPr>
+        <w:rPr>
+          <w:lang w:val="es-CO" w:bidi="ar-SA"/>
+        </w:rPr>
+      </w:pPr>
+      <w:r>
+        <w:rPr>
+          <w:lang w:val="es-CO" w:bidi="ar-SA"/>
+        </w:rPr>
+        <w:t xml:space="preserve">Mostrar hallazgos en un </w:t>
+      </w:r>
+      <w:proofErr w:type="spellStart"/>
+      <w:r>
+        <w:rPr>
+          <w:lang w:val="es-CO" w:bidi="ar-SA"/>
+        </w:rPr>
+        <w:t>dashboard</w:t>
+      </w:r>
+      <w:proofErr w:type="spellEnd"/>
+      <w:r>
+        <w:rPr>
+          <w:lang w:val="es-CO" w:bidi="ar-SA"/>
+        </w:rPr>
+        <w:t xml:space="preserve"> (</w:t>
+      </w:r>
+      <w:proofErr w:type="spellStart"/>
+      <w:r>
+        <w:rPr>
+          <w:lang w:val="es-CO" w:bidi="ar-SA"/>
+        </w:rPr>
+        <w:t>Tableau</w:t>
+      </w:r>
+      <w:proofErr w:type="spellEnd"/>
+      <w:r>
+        <w:rPr>
+          <w:lang w:val="es-CO" w:bidi="ar-SA"/>
+        </w:rPr>
+        <w:t>/Power BI/</w:t>
+      </w:r>
+      <w:proofErr w:type="spellStart"/>
+      <w:r>
+        <w:rPr>
+          <w:lang w:val="es-CO" w:bidi="ar-SA"/>
+        </w:rPr>
+        <w:t>Streamlit</w:t>
+      </w:r>
+      <w:proofErr w:type="spellEnd"/>
+      <w:r>
+        <w:rPr>
+          <w:lang w:val="es-CO" w:bidi="ar-SA"/>
+        </w:rPr>
+        <w:t>) e identificar zonas/franjas críticas.</w:t>
+      </w:r>
+    </w:p>
+    <w:p>
+      <w:pPr>
+        <w:pStyle w:val="Prrafodelista"/>
+        <w:numPr>
+          <w:ilvl w:val="0"/>
+          <w:numId w:val="10"/>
+        </w:numPr>
+        <w:rPr>
+          <w:lang w:val="es-CO" w:bidi="ar-SA"/>
+        </w:rPr>
+      </w:pPr>
+      <w:r>
+        <w:rPr>
+          <w:lang w:val="es-CO" w:bidi="ar-SA"/>
+        </w:rPr>
+        <w:t xml:space="preserve">Modelar con Deep </w:t>
+      </w:r>
+      <w:proofErr w:type="spellStart"/>
+      <w:r>
+        <w:rPr>
+          <w:lang w:val="es-CO" w:bidi="ar-SA"/>
+        </w:rPr>
+        <w:t>Learning</w:t>
+      </w:r>
+      <w:proofErr w:type="spellEnd"/>
+      <w:r>
+        <w:rPr>
+          <w:lang w:val="es-CO" w:bidi="ar-SA"/>
+        </w:rPr>
+        <w:t xml:space="preserve"> (red neuronal tabular con </w:t>
+      </w:r>
+      <w:proofErr w:type="spellStart"/>
+      <w:r>
+        <w:rPr>
+          <w:lang w:val="es-CO" w:bidi="ar-SA"/>
+        </w:rPr>
+        <w:t>embeddings</w:t>
+      </w:r>
+      <w:proofErr w:type="spellEnd"/>
+      <w:r>
+        <w:rPr>
+          <w:lang w:val="es-CO" w:bidi="ar-SA"/>
+        </w:rPr>
+        <w:t>): diseñar, entrenar y evaluar un modelo base para gravedad o riesgo por zona-tiempo; reportar métricas.</w:t>
+      </w:r>
+    </w:p>
+    <w:p>
+      <w:pPr>
+        <w:pStyle w:val="Prrafodelista"/>
+        <w:numPr>
+          <w:ilvl w:val="0"/>
+          <w:numId w:val="10"/>
+        </w:numPr>
+        <w:rPr>
+          <w:lang w:val="es-CO" w:bidi="ar-SA"/>
+        </w:rPr>
+      </w:pPr>
+      <w:r>
+        <w:rPr>
+          <w:lang w:val="es-CO" w:bidi="ar-SA"/>
+        </w:rPr>
+        <w:t>Documentar y publicar: metodología APA, Gantt, notebooks, CSV y gráficos organizados en el repositorio.</w:t>
+      </w:r>
       <w:r>
         <w:rPr>
           <w:lang w:val="es-CO" w:bidi="ar-SA"/>
@@ -1416,7 +1514,7 @@
           <w:lang w:val="es-CO" w:bidi="ar-SA"/>
         </w:rPr>
       </w:pPr>
-      <w:bookmarkStart w:id="3" w:name="_Toc213571305"/>
+      <w:bookmarkStart w:id="3" w:name="_Toc214742815"/>
       <w:r>
         <w:rPr>
           <w:lang w:val="es-CO" w:bidi="ar-SA"/>
@@ -1428,68 +1526,333 @@
     </w:p>
     <w:p>
       <w:pPr>
-        <w:pStyle w:val="Ttulo2"/>
-        <w:rPr>
-          <w:lang w:val="es-CO" w:bidi="ar-SA"/>
-        </w:rPr>
-      </w:pPr>
-      <w:bookmarkStart w:id="4" w:name="_Toc213571306"/>
-      <w:r>
-        <w:rPr>
-          <w:lang w:val="es-CO" w:bidi="ar-SA"/>
-        </w:rPr>
-        <w:t>Etapa 1:</w:t>
-      </w:r>
-      <w:bookmarkEnd w:id="4"/>
-      <w:r>
-        <w:rPr>
-          <w:lang w:val="es-CO" w:bidi="ar-SA"/>
-        </w:rPr>
-        <w:t xml:space="preserve"> </w:t>
-      </w:r>
-    </w:p>
-    <w:p>
-      <w:pPr>
-        <w:pStyle w:val="Ttulo2"/>
-        <w:rPr>
-          <w:lang w:val="es-CO" w:bidi="ar-SA"/>
-        </w:rPr>
-      </w:pPr>
-      <w:bookmarkStart w:id="5" w:name="_Toc213571307"/>
-      <w:r>
-        <w:rPr>
-          <w:lang w:val="es-CO" w:bidi="ar-SA"/>
-        </w:rPr>
-        <w:t>Etapa 2:</w:t>
-      </w:r>
-      <w:bookmarkEnd w:id="5"/>
-      <w:r>
-        <w:rPr>
-          <w:lang w:val="es-CO" w:bidi="ar-SA"/>
-        </w:rPr>
-        <w:t xml:space="preserve"> </w:t>
-      </w:r>
-    </w:p>
-    <w:p>
-      <w:pPr>
-        <w:pStyle w:val="Ttulo2"/>
-        <w:rPr>
-          <w:lang w:val="es-CO" w:bidi="ar-SA"/>
-        </w:rPr>
-      </w:pPr>
-      <w:bookmarkStart w:id="6" w:name="_Toc213571308"/>
-      <w:r>
-        <w:rPr>
-          <w:lang w:val="es-CO" w:bidi="ar-SA"/>
-        </w:rPr>
-        <w:t>Etapa 3:</w:t>
-      </w:r>
-      <w:bookmarkEnd w:id="6"/>
-      <w:r>
-        <w:rPr>
-          <w:lang w:val="es-CO" w:bidi="ar-SA"/>
-        </w:rPr>
-        <w:t xml:space="preserve"> </w:t>
+        <w:rPr>
+          <w:lang w:val="es-CO" w:bidi="ar-SA"/>
+        </w:rPr>
+      </w:pPr>
+      <w:r>
+        <w:rPr>
+          <w:lang w:val="es-CO" w:bidi="ar-SA"/>
+        </w:rPr>
+        <w:t xml:space="preserve">Se partió de la base local en SQLite construida en la etapa previa y se realizó un proceso reproducible de limpieza, normalización y enriquecimiento con Python (pandas, </w:t>
+      </w:r>
+      <w:proofErr w:type="spellStart"/>
+      <w:r>
+        <w:rPr>
+          <w:lang w:val="es-CO" w:bidi="ar-SA"/>
+        </w:rPr>
+        <w:t>numpy</w:t>
+      </w:r>
+      <w:proofErr w:type="spellEnd"/>
+      <w:r>
+        <w:rPr>
+          <w:lang w:val="es-CO" w:bidi="ar-SA"/>
+        </w:rPr>
+        <w:t xml:space="preserve">, </w:t>
+      </w:r>
+      <w:proofErr w:type="spellStart"/>
+      <w:r>
+        <w:rPr>
+          <w:lang w:val="es-CO" w:bidi="ar-SA"/>
+        </w:rPr>
+        <w:t>matplotlib</w:t>
+      </w:r>
+      <w:proofErr w:type="spellEnd"/>
+      <w:r>
+        <w:rPr>
+          <w:lang w:val="es-CO" w:bidi="ar-SA"/>
+        </w:rPr>
+        <w:t xml:space="preserve">). La extracción se efectuó desde la tabla incidentes (o </w:t>
+      </w:r>
+      <w:proofErr w:type="spellStart"/>
+      <w:r>
+        <w:rPr>
+          <w:lang w:val="es-CO" w:bidi="ar-SA"/>
+        </w:rPr>
+        <w:t>incidentes_raw</w:t>
+      </w:r>
+      <w:proofErr w:type="spellEnd"/>
+      <w:r>
+        <w:rPr>
+          <w:lang w:val="es-CO" w:bidi="ar-SA"/>
+        </w:rPr>
+        <w:t xml:space="preserve"> cuando fue necesario), unificando nombres de columnas al estándar </w:t>
+      </w:r>
+      <w:proofErr w:type="spellStart"/>
+      <w:r>
+        <w:rPr>
+          <w:lang w:val="es-CO" w:bidi="ar-SA"/>
+        </w:rPr>
+        <w:t>snake_case</w:t>
+      </w:r>
+      <w:proofErr w:type="spellEnd"/>
+      <w:r>
+        <w:rPr>
+          <w:lang w:val="es-CO" w:bidi="ar-SA"/>
+        </w:rPr>
+        <w:t xml:space="preserve">, eliminando duplicados (globales y por claves como expediente, </w:t>
+      </w:r>
+      <w:proofErr w:type="spellStart"/>
+      <w:r>
+        <w:rPr>
+          <w:lang w:val="es-CO" w:bidi="ar-SA"/>
+        </w:rPr>
+        <w:t>nro_radicado</w:t>
+      </w:r>
+      <w:proofErr w:type="spellEnd"/>
+      <w:r>
+        <w:rPr>
+          <w:lang w:val="es-CO" w:bidi="ar-SA"/>
+        </w:rPr>
+        <w:t>, fecha_*), y tipificando variables numéricas (</w:t>
+      </w:r>
+      <w:proofErr w:type="spellStart"/>
+      <w:r>
+        <w:rPr>
+          <w:lang w:val="es-CO" w:bidi="ar-SA"/>
+        </w:rPr>
+        <w:t>numcomuna</w:t>
+      </w:r>
+      <w:proofErr w:type="spellEnd"/>
+      <w:r>
+        <w:rPr>
+          <w:lang w:val="es-CO" w:bidi="ar-SA"/>
+        </w:rPr>
+        <w:t>, coordenadas X/Y).</w:t>
+      </w:r>
+    </w:p>
+    <w:p>
+      <w:pPr>
+        <w:rPr>
+          <w:lang w:val="es-CO" w:bidi="ar-SA"/>
+        </w:rPr>
+      </w:pPr>
+      <w:r>
+        <w:rPr>
+          <w:lang w:val="es-CO" w:bidi="ar-SA"/>
+        </w:rPr>
+        <w:t xml:space="preserve">Para el </w:t>
+      </w:r>
+      <w:r>
+        <w:rPr>
+          <w:b/>
+          <w:bCs/>
+          <w:lang w:val="es-CO" w:bidi="ar-SA"/>
+        </w:rPr>
+        <w:t>enriquecimiento temporal</w:t>
+      </w:r>
+      <w:r>
+        <w:rPr>
+          <w:lang w:val="es-CO" w:bidi="ar-SA"/>
+        </w:rPr>
+        <w:t xml:space="preserve">, se derivaron fecha y hora de los campos disponibles; cuando faltaron se generaron fechas aleatorias en 2022–2024 con semilla fija, garantizando replicabilidad. A partir de fecha se construyeron </w:t>
+      </w:r>
+      <w:proofErr w:type="spellStart"/>
+      <w:r>
+        <w:rPr>
+          <w:lang w:val="es-CO" w:bidi="ar-SA"/>
+        </w:rPr>
+        <w:t>anio</w:t>
+      </w:r>
+      <w:proofErr w:type="spellEnd"/>
+      <w:r>
+        <w:rPr>
+          <w:lang w:val="es-CO" w:bidi="ar-SA"/>
+        </w:rPr>
+        <w:t xml:space="preserve">, mes, </w:t>
+      </w:r>
+      <w:proofErr w:type="spellStart"/>
+      <w:r>
+        <w:rPr>
+          <w:lang w:val="es-CO" w:bidi="ar-SA"/>
+        </w:rPr>
+        <w:t>dia</w:t>
+      </w:r>
+      <w:proofErr w:type="spellEnd"/>
+      <w:r>
+        <w:rPr>
+          <w:lang w:val="es-CO" w:bidi="ar-SA"/>
+        </w:rPr>
+        <w:t xml:space="preserve">, </w:t>
+      </w:r>
+      <w:proofErr w:type="spellStart"/>
+      <w:r>
+        <w:rPr>
+          <w:lang w:val="es-CO" w:bidi="ar-SA"/>
+        </w:rPr>
+        <w:t>anio_mes</w:t>
+      </w:r>
+      <w:proofErr w:type="spellEnd"/>
+      <w:r>
+        <w:rPr>
+          <w:lang w:val="es-CO" w:bidi="ar-SA"/>
+        </w:rPr>
+        <w:t xml:space="preserve">, </w:t>
+      </w:r>
+      <w:proofErr w:type="spellStart"/>
+      <w:r>
+        <w:rPr>
+          <w:lang w:val="es-CO" w:bidi="ar-SA"/>
+        </w:rPr>
+        <w:t>hora_num</w:t>
+      </w:r>
+      <w:proofErr w:type="spellEnd"/>
+      <w:r>
+        <w:rPr>
+          <w:lang w:val="es-CO" w:bidi="ar-SA"/>
+        </w:rPr>
+        <w:t xml:space="preserve">, y </w:t>
+      </w:r>
+      <w:proofErr w:type="spellStart"/>
+      <w:r>
+        <w:rPr>
+          <w:lang w:val="es-CO" w:bidi="ar-SA"/>
+        </w:rPr>
+        <w:t>franja_horaria</w:t>
+      </w:r>
+      <w:proofErr w:type="spellEnd"/>
+      <w:r>
+        <w:rPr>
+          <w:lang w:val="es-CO" w:bidi="ar-SA"/>
+        </w:rPr>
+        <w:t>; además, se normalizaron variables categóricas clave (</w:t>
+      </w:r>
+      <w:proofErr w:type="spellStart"/>
+      <w:r>
+        <w:rPr>
+          <w:lang w:val="es-CO" w:bidi="ar-SA"/>
+        </w:rPr>
+        <w:t>clase_accidente</w:t>
+      </w:r>
+      <w:proofErr w:type="spellEnd"/>
+      <w:r>
+        <w:rPr>
+          <w:lang w:val="es-CO" w:bidi="ar-SA"/>
+        </w:rPr>
+        <w:t>, gravedad, comuna, barrio).</w:t>
+      </w:r>
+    </w:p>
+    <w:p>
+      <w:pPr>
+        <w:rPr>
+          <w:lang w:val="es-CO" w:bidi="ar-SA"/>
+        </w:rPr>
+      </w:pPr>
+      <w:r>
+        <w:rPr>
+          <w:lang w:val="es-CO" w:bidi="ar-SA"/>
+        </w:rPr>
+        <w:t xml:space="preserve">El </w:t>
+      </w:r>
+      <w:r>
+        <w:rPr>
+          <w:b/>
+          <w:bCs/>
+          <w:lang w:val="es-CO" w:bidi="ar-SA"/>
+        </w:rPr>
+        <w:t>análisis descriptivo</w:t>
+      </w:r>
+      <w:r>
+        <w:rPr>
+          <w:lang w:val="es-CO" w:bidi="ar-SA"/>
+        </w:rPr>
+        <w:t xml:space="preserve"> (EDA) se enfocó en las cinco variables </w:t>
+      </w:r>
+      <w:r>
+        <w:rPr>
+          <w:lang w:val="es-CO" w:bidi="ar-SA"/>
+        </w:rPr>
+        <w:t>claves definidas previamente</w:t>
+      </w:r>
+      <w:r>
+        <w:rPr>
+          <w:lang w:val="es-CO" w:bidi="ar-SA"/>
+        </w:rPr>
+        <w:t xml:space="preserve"> (tiempo/fecha, </w:t>
+      </w:r>
+      <w:proofErr w:type="spellStart"/>
+      <w:r>
+        <w:rPr>
+          <w:lang w:val="es-CO" w:bidi="ar-SA"/>
+        </w:rPr>
+        <w:t>clase_accidente</w:t>
+      </w:r>
+      <w:proofErr w:type="spellEnd"/>
+      <w:r>
+        <w:rPr>
+          <w:lang w:val="es-CO" w:bidi="ar-SA"/>
+        </w:rPr>
+        <w:t>, gravedad, comuna/</w:t>
+      </w:r>
+      <w:proofErr w:type="spellStart"/>
+      <w:r>
+        <w:rPr>
+          <w:lang w:val="es-CO" w:bidi="ar-SA"/>
+        </w:rPr>
+        <w:t>numcomuna</w:t>
+      </w:r>
+      <w:proofErr w:type="spellEnd"/>
+      <w:r>
+        <w:rPr>
+          <w:lang w:val="es-CO" w:bidi="ar-SA"/>
+        </w:rPr>
+        <w:t xml:space="preserve">), produciendo estadísticas (describe) y visualizaciones (barras para Top-10 comunas, clase y gravedad; serie temporal mensual; histograma por hora y correlación numérica). Las figuras se exportaron a </w:t>
+      </w:r>
+      <w:proofErr w:type="spellStart"/>
+      <w:r>
+        <w:rPr>
+          <w:lang w:val="es-CO" w:bidi="ar-SA"/>
+        </w:rPr>
+        <w:t>docs</w:t>
+      </w:r>
+      <w:proofErr w:type="spellEnd"/>
+      <w:r>
+        <w:rPr>
+          <w:lang w:val="es-CO" w:bidi="ar-SA"/>
+        </w:rPr>
+        <w:t>/</w:t>
+      </w:r>
+      <w:proofErr w:type="spellStart"/>
+      <w:r>
+        <w:rPr>
+          <w:lang w:val="es-CO" w:bidi="ar-SA"/>
+        </w:rPr>
+        <w:t>graficos</w:t>
+      </w:r>
+      <w:proofErr w:type="spellEnd"/>
+      <w:r>
+        <w:rPr>
+          <w:lang w:val="es-CO" w:bidi="ar-SA"/>
+        </w:rPr>
+        <w:t xml:space="preserve">/ y el </w:t>
+      </w:r>
+      <w:proofErr w:type="spellStart"/>
+      <w:r>
+        <w:rPr>
+          <w:lang w:val="es-CO" w:bidi="ar-SA"/>
+        </w:rPr>
+        <w:t>dataset</w:t>
+      </w:r>
+      <w:proofErr w:type="spellEnd"/>
+      <w:r>
+        <w:rPr>
+          <w:lang w:val="es-CO" w:bidi="ar-SA"/>
+        </w:rPr>
+        <w:t xml:space="preserve"> enriquecido a data/dataset_enriquecido.csv. El flujo conserva la persistencia en la base mediante la tabla </w:t>
+      </w:r>
+      <w:proofErr w:type="spellStart"/>
+      <w:r>
+        <w:rPr>
+          <w:lang w:val="es-CO" w:bidi="ar-SA"/>
+        </w:rPr>
+        <w:t>incidentes_enriquecido</w:t>
+      </w:r>
+      <w:proofErr w:type="spellEnd"/>
+      <w:r>
+        <w:rPr>
+          <w:lang w:val="es-CO" w:bidi="ar-SA"/>
+        </w:rPr>
+        <w:t>, lo que habilita consultas posteriores.</w:t>
       </w:r>
       <w:r>
         <w:rPr>
@@ -1505,7 +1868,7 @@
           <w:lang w:bidi="ar-SA"/>
         </w:rPr>
       </w:pPr>
-      <w:bookmarkStart w:id="7" w:name="_Toc213571309"/>
+      <w:bookmarkStart w:id="4" w:name="_Toc214742816"/>
       <w:r>
         <w:rPr>
           <w:lang w:bidi="ar-SA"/>
@@ -1513,7 +1876,7 @@
         <w:lastRenderedPageBreak/>
         <w:t>Resultados</w:t>
       </w:r>
-      <w:bookmarkEnd w:id="7"/>
+      <w:bookmarkEnd w:id="4"/>
     </w:p>
     <w:p>
       <w:pPr>
@@ -1531,10 +1894,14 @@
         <w:br w:type="page"/>
       </w:r>
     </w:p>
-    <w:bookmarkStart w:id="8" w:name="_Toc213571310" w:displacedByCustomXml="next"/>
+    <w:bookmarkStart w:id="5" w:name="_Toc214742817" w:displacedByCustomXml="next"/>
     <w:sdt>
       <w:sdtPr>
         <w:rPr>
+          <w:rFonts w:eastAsia="NSimSun" w:cs="Arial"/>
+          <w:b w:val="0"/>
+          <w:sz w:val="24"/>
+          <w:szCs w:val="24"/>
           <w:lang w:val="es-MX"/>
         </w:rPr>
         <w:id w:val="56988463"/>
@@ -1545,10 +1912,6 @@
       </w:sdtPr>
       <w:sdtEndPr>
         <w:rPr>
-          <w:rFonts w:eastAsia="NSimSun" w:cs="Arial"/>
-          <w:b w:val="0"/>
-          <w:sz w:val="24"/>
-          <w:szCs w:val="24"/>
           <w:lang w:val="es-AR"/>
         </w:rPr>
       </w:sdtEndPr>
@@ -1563,19 +1926,17 @@
             </w:rPr>
             <w:t>Referencias</w:t>
           </w:r>
-          <w:bookmarkEnd w:id="8"/>
+          <w:bookmarkEnd w:id="5"/>
         </w:p>
         <w:sdt>
           <w:sdtPr>
-            <w:id w:val="-573587230"/>
-            <w:bibliography/>
-          </w:sdtPr>
-          <w:sdtEndPr>
             <w:rPr>
               <w:rFonts w:cs="Arial"/>
               <w:szCs w:val="24"/>
             </w:rPr>
-          </w:sdtEndPr>
+            <w:id w:val="-573587230"/>
+            <w:bibliography/>
+          </w:sdtPr>
           <w:sdtContent>
             <w:p>
               <w:pPr>
@@ -2442,6 +2803,92 @@
     </w:lvl>
   </w:abstractNum>
   <w:abstractNum w:abstractNumId="7" w15:restartNumberingAfterBreak="0">
+    <w:nsid w:val="45DE061D"/>
+    <w:multiLevelType w:val="hybridMultilevel"/>
+    <w:tmpl w:val="6DDE6028"/>
+    <w:lvl w:ilvl="0" w:tplc="240A000F">
+      <w:start w:val="1"/>
+      <w:numFmt w:val="decimal"/>
+      <w:lvlText w:val="%1."/>
+      <w:lvlJc w:val="left"/>
+      <w:pPr>
+        <w:ind w:left="720" w:hanging="360"/>
+      </w:pPr>
+    </w:lvl>
+    <w:lvl w:ilvl="1" w:tplc="240A0019" w:tentative="1">
+      <w:start w:val="1"/>
+      <w:numFmt w:val="lowerLetter"/>
+      <w:lvlText w:val="%2."/>
+      <w:lvlJc w:val="left"/>
+      <w:pPr>
+        <w:ind w:left="1440" w:hanging="360"/>
+      </w:pPr>
+    </w:lvl>
+    <w:lvl w:ilvl="2" w:tplc="240A001B" w:tentative="1">
+      <w:start w:val="1"/>
+      <w:numFmt w:val="lowerRoman"/>
+      <w:lvlText w:val="%3."/>
+      <w:lvlJc w:val="right"/>
+      <w:pPr>
+        <w:ind w:left="2160" w:hanging="180"/>
+      </w:pPr>
+    </w:lvl>
+    <w:lvl w:ilvl="3" w:tplc="240A000F" w:tentative="1">
+      <w:start w:val="1"/>
+      <w:numFmt w:val="decimal"/>
+      <w:lvlText w:val="%4."/>
+      <w:lvlJc w:val="left"/>
+      <w:pPr>
+        <w:ind w:left="2880" w:hanging="360"/>
+      </w:pPr>
+    </w:lvl>
+    <w:lvl w:ilvl="4" w:tplc="240A0019" w:tentative="1">
+      <w:start w:val="1"/>
+      <w:numFmt w:val="lowerLetter"/>
+      <w:lvlText w:val="%5."/>
+      <w:lvlJc w:val="left"/>
+      <w:pPr>
+        <w:ind w:left="3600" w:hanging="360"/>
+      </w:pPr>
+    </w:lvl>
+    <w:lvl w:ilvl="5" w:tplc="240A001B" w:tentative="1">
+      <w:start w:val="1"/>
+      <w:numFmt w:val="lowerRoman"/>
+      <w:lvlText w:val="%6."/>
+      <w:lvlJc w:val="right"/>
+      <w:pPr>
+        <w:ind w:left="4320" w:hanging="180"/>
+      </w:pPr>
+    </w:lvl>
+    <w:lvl w:ilvl="6" w:tplc="240A000F" w:tentative="1">
+      <w:start w:val="1"/>
+      <w:numFmt w:val="decimal"/>
+      <w:lvlText w:val="%7."/>
+      <w:lvlJc w:val="left"/>
+      <w:pPr>
+        <w:ind w:left="5040" w:hanging="360"/>
+      </w:pPr>
+    </w:lvl>
+    <w:lvl w:ilvl="7" w:tplc="240A0019" w:tentative="1">
+      <w:start w:val="1"/>
+      <w:numFmt w:val="lowerLetter"/>
+      <w:lvlText w:val="%8."/>
+      <w:lvlJc w:val="left"/>
+      <w:pPr>
+        <w:ind w:left="5760" w:hanging="360"/>
+      </w:pPr>
+    </w:lvl>
+    <w:lvl w:ilvl="8" w:tplc="240A001B" w:tentative="1">
+      <w:start w:val="1"/>
+      <w:numFmt w:val="lowerRoman"/>
+      <w:lvlText w:val="%9."/>
+      <w:lvlJc w:val="right"/>
+      <w:pPr>
+        <w:ind w:left="6480" w:hanging="180"/>
+      </w:pPr>
+    </w:lvl>
+  </w:abstractNum>
+  <w:abstractNum w:abstractNumId="8" w15:restartNumberingAfterBreak="0">
     <w:nsid w:val="5BA17427"/>
     <w:multiLevelType w:val="hybridMultilevel"/>
     <w:tmpl w:val="E84C35DC"/>
@@ -2532,7 +2979,7 @@
       </w:pPr>
     </w:lvl>
   </w:abstractNum>
-  <w:abstractNum w:abstractNumId="8" w15:restartNumberingAfterBreak="0">
+  <w:abstractNum w:abstractNumId="9" w15:restartNumberingAfterBreak="0">
     <w:nsid w:val="6D244A83"/>
     <w:multiLevelType w:val="hybridMultilevel"/>
     <w:tmpl w:val="8A486352"/>
@@ -2619,7 +3066,7 @@
     </w:lvl>
   </w:abstractNum>
   <w:num w:numId="1" w16cid:durableId="543912516">
-    <w:abstractNumId w:val="8"/>
+    <w:abstractNumId w:val="9"/>
   </w:num>
   <w:num w:numId="2" w16cid:durableId="78328212">
     <w:abstractNumId w:val="0"/>
@@ -2640,10 +3087,13 @@
     <w:abstractNumId w:val="2"/>
   </w:num>
   <w:num w:numId="8" w16cid:durableId="174881650">
-    <w:abstractNumId w:val="7"/>
+    <w:abstractNumId w:val="8"/>
   </w:num>
   <w:num w:numId="9" w16cid:durableId="187790868">
     <w:abstractNumId w:val="3"/>
+  </w:num>
+  <w:num w:numId="10" w16cid:durableId="1152142178">
+    <w:abstractNumId w:val="7"/>
   </w:num>
 </w:numbering>
 </file>

</xml_diff>

<commit_message>
EA3: dashboard + doc + graficos
</commit_message>
<xml_diff>
--- a/docs/Sanchez_Usuga_Eder_David__E1.docx
+++ b/docs/Sanchez_Usuga_Eder_David__E1.docx
@@ -32,7 +32,7 @@
           <w:bCs/>
           <w:lang w:val="es-CO" w:bidi="ar-SA"/>
         </w:rPr>
-        <w:t>2</w:t>
+        <w:t>3</w:t>
       </w:r>
     </w:p>
     <w:p>
@@ -62,7 +62,21 @@
         <w:rPr>
           <w:lang w:val="es-CO" w:bidi="ar-SA"/>
         </w:rPr>
-        <w:t>Análisis de una necesidad de ingeniería de datos</w:t>
+        <w:t xml:space="preserve">Presentación del proyecto y </w:t>
+      </w:r>
+      <w:proofErr w:type="spellStart"/>
+      <w:r>
+        <w:rPr>
+          <w:lang w:val="es-CO" w:bidi="ar-SA"/>
+        </w:rPr>
+        <w:t>dashboard</w:t>
+      </w:r>
+      <w:proofErr w:type="spellEnd"/>
+      <w:r>
+        <w:rPr>
+          <w:lang w:val="es-CO" w:bidi="ar-SA"/>
+        </w:rPr>
+        <w:t xml:space="preserve"> descriptivo</w:t>
       </w:r>
     </w:p>
     <w:p>
@@ -344,7 +358,7 @@
           <w:rFonts w:eastAsia="Times New Roman"/>
           <w:lang w:val="es-CO" w:bidi="ar-SA"/>
         </w:rPr>
-        <w:t>Noviembre</w:t>
+        <w:t>Diciembre</w:t>
       </w:r>
       <w:r>
         <w:rPr>
@@ -1197,7 +1211,6 @@
           <w:numId w:val="10"/>
         </w:numPr>
         <w:rPr>
-          <w:rFonts w:hint="eastAsia"/>
           <w:lang w:val="es-CO" w:bidi="ar-SA"/>
         </w:rPr>
       </w:pPr>
@@ -1756,19 +1769,7 @@
         <w:rPr>
           <w:lang w:val="es-CO" w:bidi="ar-SA"/>
         </w:rPr>
-        <w:t xml:space="preserve"> (EDA) se enfocó en las cinco variables </w:t>
-      </w:r>
-      <w:r>
-        <w:rPr>
-          <w:lang w:val="es-CO" w:bidi="ar-SA"/>
-        </w:rPr>
-        <w:t>claves definidas previamente</w:t>
-      </w:r>
-      <w:r>
-        <w:rPr>
-          <w:lang w:val="es-CO" w:bidi="ar-SA"/>
-        </w:rPr>
-        <w:t xml:space="preserve"> (tiempo/fecha, </w:t>
+        <w:t xml:space="preserve"> (EDA) se enfocó en las cinco variables claves definidas previamente (tiempo/fecha, </w:t>
       </w:r>
       <w:proofErr w:type="spellStart"/>
       <w:r>
@@ -1877,6 +1878,1129 @@
         <w:t>Resultados</w:t>
       </w:r>
       <w:bookmarkEnd w:id="4"/>
+    </w:p>
+    <w:p>
+      <w:pPr>
+        <w:rPr>
+          <w:lang w:bidi="ar-SA"/>
+        </w:rPr>
+      </w:pPr>
+      <w:r>
+        <w:rPr>
+          <w:lang w:bidi="ar-SA"/>
+        </w:rPr>
+        <w:t xml:space="preserve">En esta sección presento los resultados obtenidos a partir del </w:t>
+      </w:r>
+      <w:proofErr w:type="spellStart"/>
+      <w:r>
+        <w:rPr>
+          <w:lang w:bidi="ar-SA"/>
+        </w:rPr>
+        <w:t>dataset</w:t>
+      </w:r>
+      <w:proofErr w:type="spellEnd"/>
+      <w:r>
+        <w:rPr>
+          <w:lang w:bidi="ar-SA"/>
+        </w:rPr>
+        <w:t xml:space="preserve"> enriquecido y del tablero interactivo construido para explorar las cinco variables clave: </w:t>
+      </w:r>
+      <w:proofErr w:type="spellStart"/>
+      <w:r>
+        <w:rPr>
+          <w:lang w:bidi="ar-SA"/>
+        </w:rPr>
+        <w:t>clase_accidente</w:t>
+      </w:r>
+      <w:proofErr w:type="spellEnd"/>
+      <w:r>
+        <w:rPr>
+          <w:lang w:bidi="ar-SA"/>
+        </w:rPr>
+        <w:t xml:space="preserve">, gravedad, comuna, </w:t>
+      </w:r>
+      <w:proofErr w:type="spellStart"/>
+      <w:r>
+        <w:rPr>
+          <w:lang w:bidi="ar-SA"/>
+        </w:rPr>
+        <w:t>anio_mes</w:t>
+      </w:r>
+      <w:proofErr w:type="spellEnd"/>
+      <w:r>
+        <w:rPr>
+          <w:lang w:bidi="ar-SA"/>
+        </w:rPr>
+        <w:t xml:space="preserve"> (componente temporal) y </w:t>
+      </w:r>
+      <w:proofErr w:type="spellStart"/>
+      <w:r>
+        <w:rPr>
+          <w:lang w:bidi="ar-SA"/>
+        </w:rPr>
+        <w:t>franja_horaria</w:t>
+      </w:r>
+      <w:proofErr w:type="spellEnd"/>
+      <w:r>
+        <w:rPr>
+          <w:lang w:bidi="ar-SA"/>
+        </w:rPr>
+        <w:t>/</w:t>
+      </w:r>
+      <w:proofErr w:type="spellStart"/>
+      <w:r>
+        <w:rPr>
+          <w:lang w:bidi="ar-SA"/>
+        </w:rPr>
+        <w:t>hora_num</w:t>
+      </w:r>
+      <w:proofErr w:type="spellEnd"/>
+      <w:r>
+        <w:rPr>
+          <w:lang w:bidi="ar-SA"/>
+        </w:rPr>
+        <w:t>.</w:t>
+      </w:r>
+    </w:p>
+    <w:p>
+      <w:pPr>
+        <w:rPr>
+          <w:lang w:bidi="ar-SA"/>
+        </w:rPr>
+      </w:pPr>
+      <w:r>
+        <w:rPr>
+          <w:lang w:bidi="ar-SA"/>
+        </w:rPr>
+        <w:t xml:space="preserve">El </w:t>
+      </w:r>
+      <w:proofErr w:type="spellStart"/>
+      <w:r>
+        <w:rPr>
+          <w:lang w:bidi="ar-SA"/>
+        </w:rPr>
+        <w:t>dashboard</w:t>
+      </w:r>
+      <w:proofErr w:type="spellEnd"/>
+      <w:r>
+        <w:rPr>
+          <w:lang w:bidi="ar-SA"/>
+        </w:rPr>
+        <w:t xml:space="preserve"> está implementado como notebook de </w:t>
+      </w:r>
+      <w:proofErr w:type="spellStart"/>
+      <w:r>
+        <w:rPr>
+          <w:lang w:bidi="ar-SA"/>
+        </w:rPr>
+        <w:t>Jupyter</w:t>
+      </w:r>
+      <w:proofErr w:type="spellEnd"/>
+      <w:r>
+        <w:rPr>
+          <w:lang w:bidi="ar-SA"/>
+        </w:rPr>
+        <w:t xml:space="preserve"> y permite filtrar por año, mes, comuna, clase, gravedad y franja horaria, recalculando automáticamente los conteos y gráficos. Para reproducirlo:</w:t>
+      </w:r>
+    </w:p>
+    <w:p>
+      <w:pPr>
+        <w:pStyle w:val="Prrafodelista"/>
+        <w:numPr>
+          <w:ilvl w:val="0"/>
+          <w:numId w:val="11"/>
+        </w:numPr>
+        <w:rPr>
+          <w:lang w:bidi="ar-SA"/>
+        </w:rPr>
+      </w:pPr>
+      <w:r>
+        <w:rPr>
+          <w:lang w:bidi="ar-SA"/>
+        </w:rPr>
+        <w:t>Ruta: notebooks/EA3_dashboard_sql.ipynb (DB-</w:t>
+      </w:r>
+      <w:proofErr w:type="spellStart"/>
+      <w:r>
+        <w:rPr>
+          <w:lang w:bidi="ar-SA"/>
+        </w:rPr>
+        <w:t>first</w:t>
+      </w:r>
+      <w:proofErr w:type="spellEnd"/>
+      <w:r>
+        <w:rPr>
+          <w:lang w:bidi="ar-SA"/>
+        </w:rPr>
+        <w:t>) o notebooks/EA3_csv_rapido.ipynb (CSV-</w:t>
+      </w:r>
+      <w:proofErr w:type="spellStart"/>
+      <w:r>
+        <w:rPr>
+          <w:lang w:bidi="ar-SA"/>
+        </w:rPr>
+        <w:t>first</w:t>
+      </w:r>
+      <w:proofErr w:type="spellEnd"/>
+      <w:r>
+        <w:rPr>
+          <w:lang w:bidi="ar-SA"/>
+        </w:rPr>
+        <w:t>).</w:t>
+      </w:r>
+    </w:p>
+    <w:p>
+      <w:pPr>
+        <w:pStyle w:val="Prrafodelista"/>
+        <w:numPr>
+          <w:ilvl w:val="0"/>
+          <w:numId w:val="11"/>
+        </w:numPr>
+        <w:rPr>
+          <w:lang w:bidi="ar-SA"/>
+        </w:rPr>
+      </w:pPr>
+      <w:r>
+        <w:rPr>
+          <w:lang w:bidi="ar-SA"/>
+        </w:rPr>
+        <w:t xml:space="preserve">Datos de entrada: data/dataset_enriquecido.csv (principal) y, opcionalmente, </w:t>
+      </w:r>
+      <w:proofErr w:type="spellStart"/>
+      <w:r>
+        <w:rPr>
+          <w:lang w:bidi="ar-SA"/>
+        </w:rPr>
+        <w:t>db</w:t>
+      </w:r>
+      <w:proofErr w:type="spellEnd"/>
+      <w:r>
+        <w:rPr>
+          <w:lang w:bidi="ar-SA"/>
+        </w:rPr>
+        <w:t>/</w:t>
+      </w:r>
+      <w:proofErr w:type="spellStart"/>
+      <w:r>
+        <w:rPr>
+          <w:lang w:bidi="ar-SA"/>
+        </w:rPr>
+        <w:t>proyecto.db</w:t>
+      </w:r>
+      <w:proofErr w:type="spellEnd"/>
+      <w:r>
+        <w:rPr>
+          <w:lang w:bidi="ar-SA"/>
+        </w:rPr>
+        <w:t>.</w:t>
+      </w:r>
+    </w:p>
+    <w:p>
+      <w:pPr>
+        <w:pStyle w:val="Prrafodelista"/>
+        <w:numPr>
+          <w:ilvl w:val="0"/>
+          <w:numId w:val="11"/>
+        </w:numPr>
+        <w:rPr>
+          <w:lang w:bidi="ar-SA"/>
+        </w:rPr>
+      </w:pPr>
+      <w:r>
+        <w:rPr>
+          <w:lang w:bidi="ar-SA"/>
+        </w:rPr>
+        <w:t xml:space="preserve">Salidas gráficas (evidencias): se guardan en </w:t>
+      </w:r>
+      <w:proofErr w:type="spellStart"/>
+      <w:r>
+        <w:rPr>
+          <w:lang w:bidi="ar-SA"/>
+        </w:rPr>
+        <w:t>docs</w:t>
+      </w:r>
+      <w:proofErr w:type="spellEnd"/>
+      <w:r>
+        <w:rPr>
+          <w:lang w:bidi="ar-SA"/>
+        </w:rPr>
+        <w:t>/</w:t>
+      </w:r>
+      <w:proofErr w:type="spellStart"/>
+      <w:r>
+        <w:rPr>
+          <w:lang w:bidi="ar-SA"/>
+        </w:rPr>
+        <w:t>graficos</w:t>
+      </w:r>
+      <w:proofErr w:type="spellEnd"/>
+      <w:r>
+        <w:rPr>
+          <w:lang w:bidi="ar-SA"/>
+        </w:rPr>
+        <w:t>/ con nombres normalizados (por ejemplo, 01_clase_accidente.png).</w:t>
+      </w:r>
+    </w:p>
+    <w:p>
+      <w:pPr>
+        <w:rPr>
+          <w:lang w:bidi="ar-SA"/>
+        </w:rPr>
+      </w:pPr>
+      <w:r>
+        <w:rPr>
+          <w:lang w:bidi="ar-SA"/>
+        </w:rPr>
+        <w:t xml:space="preserve">El tablero facilita la interpretación visual de patrones por tipo de siniestro, severidad, distribución geográfica y comportamiento temporal, lo que me permite construir hallazgos replicables y auditablemente trazables al </w:t>
+      </w:r>
+      <w:proofErr w:type="spellStart"/>
+      <w:r>
+        <w:rPr>
+          <w:lang w:bidi="ar-SA"/>
+        </w:rPr>
+        <w:t>dataset</w:t>
+      </w:r>
+      <w:proofErr w:type="spellEnd"/>
+      <w:r>
+        <w:rPr>
+          <w:lang w:bidi="ar-SA"/>
+        </w:rPr>
+        <w:t>.</w:t>
+      </w:r>
+    </w:p>
+    <w:p>
+      <w:pPr>
+        <w:suppressAutoHyphens w:val="0"/>
+        <w:spacing w:after="160" w:line="259" w:lineRule="auto"/>
+        <w:rPr>
+          <w:lang w:bidi="ar-SA"/>
+        </w:rPr>
+      </w:pPr>
+      <w:r>
+        <w:rPr>
+          <w:lang w:bidi="ar-SA"/>
+        </w:rPr>
+        <w:br w:type="page"/>
+      </w:r>
+    </w:p>
+    <w:p>
+      <w:pPr>
+        <w:rPr>
+          <w:lang w:bidi="ar-SA"/>
+        </w:rPr>
+      </w:pPr>
+      <w:r>
+        <w:rPr>
+          <w:b/>
+          <w:bCs/>
+          <w:noProof/>
+          <w:lang w:bidi="ar-SA"/>
+        </w:rPr>
+        <w:lastRenderedPageBreak/>
+        <w:drawing>
+          <wp:anchor distT="0" distB="0" distL="114300" distR="114300" simplePos="0" relativeHeight="251659264" behindDoc="1" locked="0" layoutInCell="1" allowOverlap="1" wp14:anchorId="08B09593" wp14:editId="7BB40DBE">
+            <wp:simplePos x="0" y="0"/>
+            <wp:positionH relativeFrom="margin">
+              <wp:posOffset>-96796</wp:posOffset>
+            </wp:positionH>
+            <wp:positionV relativeFrom="paragraph">
+              <wp:posOffset>0</wp:posOffset>
+            </wp:positionV>
+            <wp:extent cx="5605780" cy="2799080"/>
+            <wp:effectExtent l="0" t="0" r="0" b="1270"/>
+            <wp:wrapTight wrapText="bothSides">
+              <wp:wrapPolygon edited="0">
+                <wp:start x="0" y="0"/>
+                <wp:lineTo x="0" y="21463"/>
+                <wp:lineTo x="21507" y="21463"/>
+                <wp:lineTo x="21507" y="0"/>
+                <wp:lineTo x="0" y="0"/>
+              </wp:wrapPolygon>
+            </wp:wrapTight>
+            <wp:docPr id="1" name="Imagen 1"/>
+            <wp:cNvGraphicFramePr>
+              <a:graphicFrameLocks xmlns:a="http://schemas.openxmlformats.org/drawingml/2006/main" noChangeAspect="1"/>
+            </wp:cNvGraphicFramePr>
+            <a:graphic xmlns:a="http://schemas.openxmlformats.org/drawingml/2006/main">
+              <a:graphicData uri="http://schemas.openxmlformats.org/drawingml/2006/picture">
+                <pic:pic xmlns:pic="http://schemas.openxmlformats.org/drawingml/2006/picture">
+                  <pic:nvPicPr>
+                    <pic:cNvPr id="0" name="Picture 1"/>
+                    <pic:cNvPicPr>
+                      <a:picLocks noChangeAspect="1" noChangeArrowheads="1"/>
+                    </pic:cNvPicPr>
+                  </pic:nvPicPr>
+                  <pic:blipFill>
+                    <a:blip r:embed="rId9" cstate="print">
+                      <a:extLst>
+                        <a:ext uri="{28A0092B-C50C-407E-A947-70E740481C1C}">
+                          <a14:useLocalDpi xmlns:a14="http://schemas.microsoft.com/office/drawing/2010/main" val="0"/>
+                        </a:ext>
+                      </a:extLst>
+                    </a:blip>
+                    <a:srcRect/>
+                    <a:stretch>
+                      <a:fillRect/>
+                    </a:stretch>
+                  </pic:blipFill>
+                  <pic:spPr bwMode="auto">
+                    <a:xfrm>
+                      <a:off x="0" y="0"/>
+                      <a:ext cx="5605780" cy="2799080"/>
+                    </a:xfrm>
+                    <a:prstGeom prst="rect">
+                      <a:avLst/>
+                    </a:prstGeom>
+                    <a:noFill/>
+                    <a:ln>
+                      <a:noFill/>
+                    </a:ln>
+                  </pic:spPr>
+                </pic:pic>
+              </a:graphicData>
+            </a:graphic>
+            <wp14:sizeRelH relativeFrom="page">
+              <wp14:pctWidth>0</wp14:pctWidth>
+            </wp14:sizeRelH>
+            <wp14:sizeRelV relativeFrom="page">
+              <wp14:pctHeight>0</wp14:pctHeight>
+            </wp14:sizeRelV>
+          </wp:anchor>
+        </w:drawing>
+      </w:r>
+      <w:r>
+        <w:rPr>
+          <w:b/>
+          <w:bCs/>
+          <w:lang w:bidi="ar-SA"/>
+        </w:rPr>
+        <w:t>Figura 1.</w:t>
+      </w:r>
+      <w:r>
+        <w:rPr>
+          <w:lang w:bidi="ar-SA"/>
+        </w:rPr>
+        <w:t xml:space="preserve"> Distribución por clase de accidente</w:t>
+      </w:r>
+    </w:p>
+    <w:p>
+      <w:pPr>
+        <w:rPr>
+          <w:sz w:val="22"/>
+          <w:szCs w:val="22"/>
+        </w:rPr>
+      </w:pPr>
+      <w:r>
+        <w:rPr>
+          <w:b/>
+          <w:bCs/>
+          <w:sz w:val="22"/>
+          <w:szCs w:val="22"/>
+        </w:rPr>
+        <w:t>Archivo:</w:t>
+      </w:r>
+      <w:r>
+        <w:rPr>
+          <w:sz w:val="22"/>
+          <w:szCs w:val="22"/>
+        </w:rPr>
+        <w:t xml:space="preserve"> </w:t>
+      </w:r>
+      <w:proofErr w:type="spellStart"/>
+      <w:r>
+        <w:rPr>
+          <w:sz w:val="22"/>
+          <w:szCs w:val="22"/>
+        </w:rPr>
+        <w:t>docs</w:t>
+      </w:r>
+      <w:proofErr w:type="spellEnd"/>
+      <w:r>
+        <w:rPr>
+          <w:sz w:val="22"/>
+          <w:szCs w:val="22"/>
+        </w:rPr>
+        <w:t>/</w:t>
+      </w:r>
+      <w:proofErr w:type="spellStart"/>
+      <w:r>
+        <w:rPr>
+          <w:sz w:val="22"/>
+          <w:szCs w:val="22"/>
+        </w:rPr>
+        <w:t>graficos</w:t>
+      </w:r>
+      <w:proofErr w:type="spellEnd"/>
+      <w:r>
+        <w:rPr>
+          <w:sz w:val="22"/>
+          <w:szCs w:val="22"/>
+        </w:rPr>
+        <w:t>/01_clase_accidente.png</w:t>
+      </w:r>
+    </w:p>
+    <w:p>
+      <w:pPr>
+        <w:rPr>
+          <w:lang w:bidi="ar-SA"/>
+        </w:rPr>
+      </w:pPr>
+      <w:r>
+        <w:rPr>
+          <w:noProof/>
+          <w:lang w:bidi="ar-SA"/>
+        </w:rPr>
+        <w:drawing>
+          <wp:anchor distT="0" distB="0" distL="114300" distR="114300" simplePos="0" relativeHeight="251660288" behindDoc="1" locked="0" layoutInCell="1" allowOverlap="1" wp14:anchorId="55BBF3C7" wp14:editId="343F4E85">
+            <wp:simplePos x="0" y="0"/>
+            <wp:positionH relativeFrom="margin">
+              <wp:align>left</wp:align>
+            </wp:positionH>
+            <wp:positionV relativeFrom="paragraph">
+              <wp:posOffset>761613</wp:posOffset>
+            </wp:positionV>
+            <wp:extent cx="5605780" cy="2799080"/>
+            <wp:effectExtent l="0" t="0" r="0" b="1270"/>
+            <wp:wrapTight wrapText="bothSides">
+              <wp:wrapPolygon edited="0">
+                <wp:start x="0" y="0"/>
+                <wp:lineTo x="0" y="21463"/>
+                <wp:lineTo x="21507" y="21463"/>
+                <wp:lineTo x="21507" y="0"/>
+                <wp:lineTo x="0" y="0"/>
+              </wp:wrapPolygon>
+            </wp:wrapTight>
+            <wp:docPr id="2" name="Imagen 2"/>
+            <wp:cNvGraphicFramePr>
+              <a:graphicFrameLocks xmlns:a="http://schemas.openxmlformats.org/drawingml/2006/main" noChangeAspect="1"/>
+            </wp:cNvGraphicFramePr>
+            <a:graphic xmlns:a="http://schemas.openxmlformats.org/drawingml/2006/main">
+              <a:graphicData uri="http://schemas.openxmlformats.org/drawingml/2006/picture">
+                <pic:pic xmlns:pic="http://schemas.openxmlformats.org/drawingml/2006/picture">
+                  <pic:nvPicPr>
+                    <pic:cNvPr id="0" name="Picture 2"/>
+                    <pic:cNvPicPr>
+                      <a:picLocks noChangeAspect="1" noChangeArrowheads="1"/>
+                    </pic:cNvPicPr>
+                  </pic:nvPicPr>
+                  <pic:blipFill>
+                    <a:blip r:embed="rId10" cstate="print">
+                      <a:extLst>
+                        <a:ext uri="{28A0092B-C50C-407E-A947-70E740481C1C}">
+                          <a14:useLocalDpi xmlns:a14="http://schemas.microsoft.com/office/drawing/2010/main" val="0"/>
+                        </a:ext>
+                      </a:extLst>
+                    </a:blip>
+                    <a:srcRect/>
+                    <a:stretch>
+                      <a:fillRect/>
+                    </a:stretch>
+                  </pic:blipFill>
+                  <pic:spPr bwMode="auto">
+                    <a:xfrm>
+                      <a:off x="0" y="0"/>
+                      <a:ext cx="5605780" cy="2799080"/>
+                    </a:xfrm>
+                    <a:prstGeom prst="rect">
+                      <a:avLst/>
+                    </a:prstGeom>
+                    <a:noFill/>
+                    <a:ln>
+                      <a:noFill/>
+                    </a:ln>
+                  </pic:spPr>
+                </pic:pic>
+              </a:graphicData>
+            </a:graphic>
+            <wp14:sizeRelH relativeFrom="page">
+              <wp14:pctWidth>0</wp14:pctWidth>
+            </wp14:sizeRelH>
+            <wp14:sizeRelV relativeFrom="page">
+              <wp14:pctHeight>0</wp14:pctHeight>
+            </wp14:sizeRelV>
+          </wp:anchor>
+        </w:drawing>
+      </w:r>
+      <w:r>
+        <w:rPr>
+          <w:b/>
+          <w:bCs/>
+          <w:sz w:val="22"/>
+          <w:szCs w:val="22"/>
+        </w:rPr>
+        <w:t>Descripción:</w:t>
+      </w:r>
+      <w:r>
+        <w:rPr>
+          <w:sz w:val="22"/>
+          <w:szCs w:val="22"/>
+        </w:rPr>
+        <w:t xml:space="preserve"> Barras con el conteo de incidentes por clase de siniestro (por ejemplo, choque, atropello, volcamiento). Esta visual permite identificar la clase dominante y comparar magnitudes relativas entre categorías.</w:t>
+      </w:r>
+    </w:p>
+    <w:p>
+      <w:pPr>
+        <w:rPr>
+          <w:lang w:bidi="ar-SA"/>
+        </w:rPr>
+      </w:pPr>
+      <w:r>
+        <w:rPr>
+          <w:b/>
+          <w:bCs/>
+          <w:lang w:bidi="ar-SA"/>
+        </w:rPr>
+        <w:t>Figura 2.</w:t>
+      </w:r>
+      <w:r>
+        <w:rPr>
+          <w:lang w:bidi="ar-SA"/>
+        </w:rPr>
+        <w:t xml:space="preserve"> Distribución por gravedad</w:t>
+      </w:r>
+      <w:r>
+        <w:rPr>
+          <w:lang w:bidi="ar-SA"/>
+        </w:rPr>
+        <w:br/>
+      </w:r>
+      <w:r>
+        <w:rPr>
+          <w:b/>
+          <w:bCs/>
+          <w:lang w:bidi="ar-SA"/>
+        </w:rPr>
+        <w:t>Archivo:</w:t>
+      </w:r>
+      <w:r>
+        <w:rPr>
+          <w:lang w:bidi="ar-SA"/>
+        </w:rPr>
+        <w:t xml:space="preserve"> </w:t>
+      </w:r>
+      <w:proofErr w:type="spellStart"/>
+      <w:r>
+        <w:rPr>
+          <w:lang w:bidi="ar-SA"/>
+        </w:rPr>
+        <w:t>docs</w:t>
+      </w:r>
+      <w:proofErr w:type="spellEnd"/>
+      <w:r>
+        <w:rPr>
+          <w:lang w:bidi="ar-SA"/>
+        </w:rPr>
+        <w:t>/</w:t>
+      </w:r>
+      <w:proofErr w:type="spellStart"/>
+      <w:r>
+        <w:rPr>
+          <w:lang w:bidi="ar-SA"/>
+        </w:rPr>
+        <w:t>graficos</w:t>
+      </w:r>
+      <w:proofErr w:type="spellEnd"/>
+      <w:r>
+        <w:rPr>
+          <w:lang w:bidi="ar-SA"/>
+        </w:rPr>
+        <w:t>/02_gravedad.png</w:t>
+      </w:r>
+      <w:r>
+        <w:rPr>
+          <w:lang w:bidi="ar-SA"/>
+        </w:rPr>
+        <w:br/>
+      </w:r>
+      <w:r>
+        <w:rPr>
+          <w:b/>
+          <w:bCs/>
+          <w:lang w:bidi="ar-SA"/>
+        </w:rPr>
+        <w:t>Descripción:</w:t>
+      </w:r>
+      <w:r>
+        <w:rPr>
+          <w:lang w:bidi="ar-SA"/>
+        </w:rPr>
+        <w:t xml:space="preserve"> Barras con la severidad reportada (Sólo daños, Herido, Muerto). La figura permite dimensionar la proporción de incidentes con víctimas y observar si existen cambios cuando se filtra por año o por comuna.</w:t>
+      </w:r>
+    </w:p>
+    <w:p>
+      <w:pPr>
+        <w:rPr>
+          <w:lang w:bidi="ar-SA"/>
+        </w:rPr>
+      </w:pPr>
+      <w:r>
+        <w:rPr>
+          <w:b/>
+          <w:bCs/>
+          <w:noProof/>
+          <w:lang w:bidi="ar-SA"/>
+        </w:rPr>
+        <w:lastRenderedPageBreak/>
+        <w:drawing>
+          <wp:anchor distT="0" distB="0" distL="114300" distR="114300" simplePos="0" relativeHeight="251661312" behindDoc="1" locked="0" layoutInCell="1" allowOverlap="1" wp14:anchorId="2BCBBE18" wp14:editId="54A9AB9E">
+            <wp:simplePos x="0" y="0"/>
+            <wp:positionH relativeFrom="margin">
+              <wp:align>left</wp:align>
+            </wp:positionH>
+            <wp:positionV relativeFrom="paragraph">
+              <wp:posOffset>248</wp:posOffset>
+            </wp:positionV>
+            <wp:extent cx="5605780" cy="2799080"/>
+            <wp:effectExtent l="0" t="0" r="0" b="1270"/>
+            <wp:wrapTight wrapText="bothSides">
+              <wp:wrapPolygon edited="0">
+                <wp:start x="0" y="0"/>
+                <wp:lineTo x="0" y="21463"/>
+                <wp:lineTo x="21507" y="21463"/>
+                <wp:lineTo x="21507" y="0"/>
+                <wp:lineTo x="0" y="0"/>
+              </wp:wrapPolygon>
+            </wp:wrapTight>
+            <wp:docPr id="3" name="Imagen 3"/>
+            <wp:cNvGraphicFramePr>
+              <a:graphicFrameLocks xmlns:a="http://schemas.openxmlformats.org/drawingml/2006/main" noChangeAspect="1"/>
+            </wp:cNvGraphicFramePr>
+            <a:graphic xmlns:a="http://schemas.openxmlformats.org/drawingml/2006/main">
+              <a:graphicData uri="http://schemas.openxmlformats.org/drawingml/2006/picture">
+                <pic:pic xmlns:pic="http://schemas.openxmlformats.org/drawingml/2006/picture">
+                  <pic:nvPicPr>
+                    <pic:cNvPr id="0" name="Picture 3"/>
+                    <pic:cNvPicPr>
+                      <a:picLocks noChangeAspect="1" noChangeArrowheads="1"/>
+                    </pic:cNvPicPr>
+                  </pic:nvPicPr>
+                  <pic:blipFill>
+                    <a:blip r:embed="rId11" cstate="print">
+                      <a:extLst>
+                        <a:ext uri="{28A0092B-C50C-407E-A947-70E740481C1C}">
+                          <a14:useLocalDpi xmlns:a14="http://schemas.microsoft.com/office/drawing/2010/main" val="0"/>
+                        </a:ext>
+                      </a:extLst>
+                    </a:blip>
+                    <a:srcRect/>
+                    <a:stretch>
+                      <a:fillRect/>
+                    </a:stretch>
+                  </pic:blipFill>
+                  <pic:spPr bwMode="auto">
+                    <a:xfrm>
+                      <a:off x="0" y="0"/>
+                      <a:ext cx="5605780" cy="2799080"/>
+                    </a:xfrm>
+                    <a:prstGeom prst="rect">
+                      <a:avLst/>
+                    </a:prstGeom>
+                    <a:noFill/>
+                    <a:ln>
+                      <a:noFill/>
+                    </a:ln>
+                  </pic:spPr>
+                </pic:pic>
+              </a:graphicData>
+            </a:graphic>
+            <wp14:sizeRelH relativeFrom="page">
+              <wp14:pctWidth>0</wp14:pctWidth>
+            </wp14:sizeRelH>
+            <wp14:sizeRelV relativeFrom="page">
+              <wp14:pctHeight>0</wp14:pctHeight>
+            </wp14:sizeRelV>
+          </wp:anchor>
+        </w:drawing>
+      </w:r>
+      <w:r>
+        <w:rPr>
+          <w:b/>
+          <w:bCs/>
+          <w:lang w:bidi="ar-SA"/>
+        </w:rPr>
+        <w:t>Figura 3.</w:t>
+      </w:r>
+      <w:r>
+        <w:rPr>
+          <w:lang w:bidi="ar-SA"/>
+        </w:rPr>
+        <w:t xml:space="preserve"> Top 10 comunas por incidentes</w:t>
+      </w:r>
+    </w:p>
+    <w:p>
+      <w:pPr>
+        <w:rPr>
+          <w:lang w:bidi="ar-SA"/>
+        </w:rPr>
+      </w:pPr>
+      <w:r>
+        <w:rPr>
+          <w:b/>
+          <w:bCs/>
+          <w:lang w:bidi="ar-SA"/>
+        </w:rPr>
+        <w:t>Archivo:</w:t>
+      </w:r>
+      <w:r>
+        <w:rPr>
+          <w:lang w:bidi="ar-SA"/>
+        </w:rPr>
+        <w:t xml:space="preserve"> </w:t>
+      </w:r>
+      <w:proofErr w:type="spellStart"/>
+      <w:r>
+        <w:rPr>
+          <w:lang w:bidi="ar-SA"/>
+        </w:rPr>
+        <w:t>docs</w:t>
+      </w:r>
+      <w:proofErr w:type="spellEnd"/>
+      <w:r>
+        <w:rPr>
+          <w:lang w:bidi="ar-SA"/>
+        </w:rPr>
+        <w:t>/</w:t>
+      </w:r>
+      <w:proofErr w:type="spellStart"/>
+      <w:r>
+        <w:rPr>
+          <w:lang w:bidi="ar-SA"/>
+        </w:rPr>
+        <w:t>graficos</w:t>
+      </w:r>
+      <w:proofErr w:type="spellEnd"/>
+      <w:r>
+        <w:rPr>
+          <w:lang w:bidi="ar-SA"/>
+        </w:rPr>
+        <w:t>/03_top_comunas.png</w:t>
+      </w:r>
+    </w:p>
+    <w:p>
+      <w:r>
+        <w:rPr>
+          <w:noProof/>
+          <w:lang w:bidi="ar-SA"/>
+        </w:rPr>
+        <w:drawing>
+          <wp:anchor distT="0" distB="0" distL="114300" distR="114300" simplePos="0" relativeHeight="251662336" behindDoc="1" locked="0" layoutInCell="1" allowOverlap="1" wp14:anchorId="0BEC1493" wp14:editId="71A232DC">
+            <wp:simplePos x="0" y="0"/>
+            <wp:positionH relativeFrom="margin">
+              <wp:posOffset>-55660</wp:posOffset>
+            </wp:positionH>
+            <wp:positionV relativeFrom="paragraph">
+              <wp:posOffset>723513</wp:posOffset>
+            </wp:positionV>
+            <wp:extent cx="5612130" cy="2806065"/>
+            <wp:effectExtent l="0" t="0" r="7620" b="0"/>
+            <wp:wrapTight wrapText="bothSides">
+              <wp:wrapPolygon edited="0">
+                <wp:start x="0" y="0"/>
+                <wp:lineTo x="0" y="21409"/>
+                <wp:lineTo x="21556" y="21409"/>
+                <wp:lineTo x="21556" y="0"/>
+                <wp:lineTo x="0" y="0"/>
+              </wp:wrapPolygon>
+            </wp:wrapTight>
+            <wp:docPr id="4" name="Imagen 4"/>
+            <wp:cNvGraphicFramePr>
+              <a:graphicFrameLocks xmlns:a="http://schemas.openxmlformats.org/drawingml/2006/main" noChangeAspect="1"/>
+            </wp:cNvGraphicFramePr>
+            <a:graphic xmlns:a="http://schemas.openxmlformats.org/drawingml/2006/main">
+              <a:graphicData uri="http://schemas.openxmlformats.org/drawingml/2006/picture">
+                <pic:pic xmlns:pic="http://schemas.openxmlformats.org/drawingml/2006/picture">
+                  <pic:nvPicPr>
+                    <pic:cNvPr id="0" name="Picture 4"/>
+                    <pic:cNvPicPr>
+                      <a:picLocks noChangeAspect="1" noChangeArrowheads="1"/>
+                    </pic:cNvPicPr>
+                  </pic:nvPicPr>
+                  <pic:blipFill>
+                    <a:blip r:embed="rId12">
+                      <a:extLst>
+                        <a:ext uri="{28A0092B-C50C-407E-A947-70E740481C1C}">
+                          <a14:useLocalDpi xmlns:a14="http://schemas.microsoft.com/office/drawing/2010/main" val="0"/>
+                        </a:ext>
+                      </a:extLst>
+                    </a:blip>
+                    <a:srcRect/>
+                    <a:stretch>
+                      <a:fillRect/>
+                    </a:stretch>
+                  </pic:blipFill>
+                  <pic:spPr bwMode="auto">
+                    <a:xfrm>
+                      <a:off x="0" y="0"/>
+                      <a:ext cx="5612130" cy="2806065"/>
+                    </a:xfrm>
+                    <a:prstGeom prst="rect">
+                      <a:avLst/>
+                    </a:prstGeom>
+                    <a:noFill/>
+                    <a:ln>
+                      <a:noFill/>
+                    </a:ln>
+                  </pic:spPr>
+                </pic:pic>
+              </a:graphicData>
+            </a:graphic>
+            <wp14:sizeRelH relativeFrom="page">
+              <wp14:pctWidth>0</wp14:pctWidth>
+            </wp14:sizeRelH>
+            <wp14:sizeRelV relativeFrom="page">
+              <wp14:pctHeight>0</wp14:pctHeight>
+            </wp14:sizeRelV>
+          </wp:anchor>
+        </w:drawing>
+      </w:r>
+      <w:r>
+        <w:rPr>
+          <w:b/>
+          <w:bCs/>
+          <w:lang w:bidi="ar-SA"/>
+        </w:rPr>
+        <w:t>Descripción:</w:t>
+      </w:r>
+      <w:r>
+        <w:rPr>
+          <w:lang w:bidi="ar-SA"/>
+        </w:rPr>
+        <w:t xml:space="preserve"> Ranking de comunas con mayor volumen de siniestros. Sirve para priorizar territorios con potencial intervención (señalización, control, campañas) y evaluar concentraciones geográficas.</w:t>
+      </w:r>
+    </w:p>
+    <w:p>
+      <w:r>
+        <w:rPr>
+          <w:b/>
+          <w:bCs/>
+        </w:rPr>
+        <w:t>Figura 4.</w:t>
+      </w:r>
+      <w:r>
+        <w:t xml:space="preserve"> Histograma por hora del día</w:t>
+      </w:r>
+    </w:p>
+    <w:p>
+      <w:r>
+        <w:rPr>
+          <w:b/>
+          <w:bCs/>
+        </w:rPr>
+        <w:t>Archivo:</w:t>
+      </w:r>
+      <w:r>
+        <w:t xml:space="preserve"> </w:t>
+      </w:r>
+      <w:proofErr w:type="spellStart"/>
+      <w:r>
+        <w:t>docs</w:t>
+      </w:r>
+      <w:proofErr w:type="spellEnd"/>
+      <w:r>
+        <w:t>/</w:t>
+      </w:r>
+      <w:proofErr w:type="spellStart"/>
+      <w:r>
+        <w:t>graficos</w:t>
+      </w:r>
+      <w:proofErr w:type="spellEnd"/>
+      <w:r>
+        <w:t>/04_hist_hora.png</w:t>
+      </w:r>
+    </w:p>
+    <w:p>
+      <w:r>
+        <w:rPr>
+          <w:b/>
+          <w:bCs/>
+        </w:rPr>
+        <w:t>Descripción:</w:t>
+      </w:r>
+      <w:r>
+        <w:t xml:space="preserve"> Frecuencia de incidentes por hora (0–23). Permite detectar franjas críticas (por ejemplo, horas pico) y comparar la distribución horaria por gravedad o por clase.</w:t>
+      </w:r>
+    </w:p>
+    <w:p>
+      <w:pPr>
+        <w:rPr>
+          <w:lang w:bidi="ar-SA"/>
+        </w:rPr>
+      </w:pPr>
+      <w:r>
+        <w:rPr>
+          <w:noProof/>
+          <w:lang w:bidi="ar-SA"/>
+        </w:rPr>
+        <w:lastRenderedPageBreak/>
+        <w:drawing>
+          <wp:inline distT="0" distB="0" distL="0" distR="0" wp14:anchorId="6B84A5CD" wp14:editId="5AD9A002">
+            <wp:extent cx="5605780" cy="2242185"/>
+            <wp:effectExtent l="0" t="0" r="0" b="5715"/>
+            <wp:docPr id="5" name="Imagen 5"/>
+            <wp:cNvGraphicFramePr>
+              <a:graphicFrameLocks xmlns:a="http://schemas.openxmlformats.org/drawingml/2006/main" noChangeAspect="1"/>
+            </wp:cNvGraphicFramePr>
+            <a:graphic xmlns:a="http://schemas.openxmlformats.org/drawingml/2006/main">
+              <a:graphicData uri="http://schemas.openxmlformats.org/drawingml/2006/picture">
+                <pic:pic xmlns:pic="http://schemas.openxmlformats.org/drawingml/2006/picture">
+                  <pic:nvPicPr>
+                    <pic:cNvPr id="0" name="Picture 5"/>
+                    <pic:cNvPicPr>
+                      <a:picLocks noChangeAspect="1" noChangeArrowheads="1"/>
+                    </pic:cNvPicPr>
+                  </pic:nvPicPr>
+                  <pic:blipFill>
+                    <a:blip r:embed="rId13" cstate="print">
+                      <a:extLst>
+                        <a:ext uri="{28A0092B-C50C-407E-A947-70E740481C1C}">
+                          <a14:useLocalDpi xmlns:a14="http://schemas.microsoft.com/office/drawing/2010/main" val="0"/>
+                        </a:ext>
+                      </a:extLst>
+                    </a:blip>
+                    <a:srcRect/>
+                    <a:stretch>
+                      <a:fillRect/>
+                    </a:stretch>
+                  </pic:blipFill>
+                  <pic:spPr bwMode="auto">
+                    <a:xfrm>
+                      <a:off x="0" y="0"/>
+                      <a:ext cx="5605780" cy="2242185"/>
+                    </a:xfrm>
+                    <a:prstGeom prst="rect">
+                      <a:avLst/>
+                    </a:prstGeom>
+                    <a:noFill/>
+                    <a:ln>
+                      <a:noFill/>
+                    </a:ln>
+                  </pic:spPr>
+                </pic:pic>
+              </a:graphicData>
+            </a:graphic>
+          </wp:inline>
+        </w:drawing>
+      </w:r>
+    </w:p>
+    <w:p>
+      <w:pPr>
+        <w:rPr>
+          <w:lang w:bidi="ar-SA"/>
+        </w:rPr>
+      </w:pPr>
+      <w:r>
+        <w:rPr>
+          <w:b/>
+          <w:bCs/>
+          <w:lang w:bidi="ar-SA"/>
+        </w:rPr>
+        <w:t>Figura 5.</w:t>
+      </w:r>
+      <w:r>
+        <w:rPr>
+          <w:lang w:bidi="ar-SA"/>
+        </w:rPr>
+        <w:t xml:space="preserve"> Serie temporal mensual de incidentes</w:t>
+      </w:r>
+    </w:p>
+    <w:p>
+      <w:pPr>
+        <w:rPr>
+          <w:lang w:bidi="ar-SA"/>
+        </w:rPr>
+      </w:pPr>
+      <w:r>
+        <w:rPr>
+          <w:b/>
+          <w:bCs/>
+          <w:lang w:bidi="ar-SA"/>
+        </w:rPr>
+        <w:t>Archivo:</w:t>
+      </w:r>
+      <w:r>
+        <w:rPr>
+          <w:lang w:bidi="ar-SA"/>
+        </w:rPr>
+        <w:t xml:space="preserve"> </w:t>
+      </w:r>
+      <w:proofErr w:type="spellStart"/>
+      <w:r>
+        <w:rPr>
+          <w:lang w:bidi="ar-SA"/>
+        </w:rPr>
+        <w:t>docs</w:t>
+      </w:r>
+      <w:proofErr w:type="spellEnd"/>
+      <w:r>
+        <w:rPr>
+          <w:lang w:bidi="ar-SA"/>
+        </w:rPr>
+        <w:t>/</w:t>
+      </w:r>
+      <w:proofErr w:type="spellStart"/>
+      <w:r>
+        <w:rPr>
+          <w:lang w:bidi="ar-SA"/>
+        </w:rPr>
+        <w:t>graficos</w:t>
+      </w:r>
+      <w:proofErr w:type="spellEnd"/>
+      <w:r>
+        <w:rPr>
+          <w:lang w:bidi="ar-SA"/>
+        </w:rPr>
+        <w:t>/05_serie_mensual.png</w:t>
+      </w:r>
+    </w:p>
+    <w:p>
+      <w:pPr>
+        <w:rPr>
+          <w:lang w:bidi="ar-SA"/>
+        </w:rPr>
+      </w:pPr>
+      <w:r>
+        <w:rPr>
+          <w:b/>
+          <w:bCs/>
+          <w:lang w:bidi="ar-SA"/>
+        </w:rPr>
+        <w:t>Descripción:</w:t>
+      </w:r>
+      <w:r>
+        <w:rPr>
+          <w:lang w:bidi="ar-SA"/>
+        </w:rPr>
+        <w:t xml:space="preserve"> Tendencia mensual usando </w:t>
+      </w:r>
+      <w:proofErr w:type="spellStart"/>
+      <w:r>
+        <w:rPr>
+          <w:lang w:bidi="ar-SA"/>
+        </w:rPr>
+        <w:t>anio_mes</w:t>
+      </w:r>
+      <w:proofErr w:type="spellEnd"/>
+      <w:r>
+        <w:rPr>
+          <w:lang w:bidi="ar-SA"/>
+        </w:rPr>
+        <w:t>. Esta vista ayuda a observar variaciones estacionales o cambios de nivel a través del tiempo y relacionarlos con periodos específicos (lluvias, temporadas vacacionales, etc.).</w:t>
+      </w:r>
+    </w:p>
+    <w:p>
+      <w:pPr>
+        <w:rPr>
+          <w:lang w:bidi="ar-SA"/>
+        </w:rPr>
+      </w:pPr>
+    </w:p>
+    <w:p>
+      <w:pPr>
+        <w:pStyle w:val="Ttulo1"/>
+        <w:rPr>
+          <w:lang w:bidi="ar-SA"/>
+        </w:rPr>
+      </w:pPr>
     </w:p>
     <w:p>
       <w:pPr>
@@ -1996,7 +3120,7 @@
       </w:sdtContent>
     </w:sdt>
     <w:sectPr>
-      <w:headerReference w:type="default" r:id="rId9"/>
+      <w:headerReference w:type="default" r:id="rId14"/>
       <w:pgSz w:w="12240" w:h="15840"/>
       <w:pgMar w:top="1417" w:right="1701" w:bottom="1417" w:left="1701" w:header="708" w:footer="708" w:gutter="0"/>
       <w:cols w:space="708"/>
@@ -2138,6 +3262,119 @@
 <file path=word/numbering.xml><?xml version="1.0" encoding="utf-8"?>
 <w:numbering xmlns:wpc="http://schemas.microsoft.com/office/word/2010/wordprocessingCanvas" xmlns:cx="http://schemas.microsoft.com/office/drawing/2014/chartex" xmlns:cx1="http://schemas.microsoft.com/office/drawing/2015/9/8/chartex" xmlns:cx2="http://schemas.microsoft.com/office/drawing/2015/10/21/chartex" xmlns:cx3="http://schemas.microsoft.com/office/drawing/2016/5/9/chartex" xmlns:cx4="http://schemas.microsoft.com/office/drawing/2016/5/10/chartex" xmlns:cx5="http://schemas.microsoft.com/office/drawing/2016/5/11/chartex" xmlns:cx6="http://schemas.microsoft.com/office/drawing/2016/5/12/chartex" xmlns:cx7="http://schemas.microsoft.com/office/drawing/2016/5/13/chartex" xmlns:cx8="http://schemas.microsoft.com/office/drawing/2016/5/14/chartex" xmlns:mc="http://schemas.openxmlformats.org/markup-compatibility/2006" xmlns:aink="http://schemas.microsoft.com/office/drawing/2016/ink" xmlns:am3d="http://schemas.microsoft.com/office/drawing/2017/model3d" xmlns:o="urn:schemas-microsoft-com:office:office" xmlns:oel="http://schemas.microsoft.com/office/2019/extlst" xmlns:r="http://schemas.openxmlformats.org/officeDocument/2006/relationships" xmlns:m="http://schemas.openxmlformats.org/officeDocument/2006/math" xmlns:v="urn:schemas-microsoft-com:vml" xmlns:wp14="http://schemas.microsoft.com/office/word/2010/wordprocessingDrawing" xmlns:wp="http://schemas.openxmlformats.org/drawingml/2006/wordprocessingDrawing" xmlns:w10="urn:schemas-microsoft-com:office:word" xmlns:w="http://schemas.openxmlformats.org/wordprocessingml/2006/main" xmlns:w14="http://schemas.microsoft.com/office/word/2010/wordml" xmlns:w15="http://schemas.microsoft.com/office/word/2012/wordml" xmlns:w16cex="http://schemas.microsoft.com/office/word/2018/wordml/cex" xmlns:w16cid="http://schemas.microsoft.com/office/word/2016/wordml/cid" xmlns:w16="http://schemas.microsoft.com/office/word/2018/wordml" xmlns:w16sdtdh="http://schemas.microsoft.com/office/word/2020/wordml/sdtdatahash" xmlns:w16se="http://schemas.microsoft.com/office/word/2015/wordml/symex" xmlns:wpg="http://schemas.microsoft.com/office/word/2010/wordprocessingGroup" xmlns:wpi="http://schemas.microsoft.com/office/word/2010/wordprocessingInk" xmlns:wne="http://schemas.microsoft.com/office/word/2006/wordml" xmlns:wps="http://schemas.microsoft.com/office/word/2010/wordprocessingShape" mc:Ignorable="w14 w15 w16se w16cid w16 w16cex w16sdtdh wp14">
   <w:abstractNum w:abstractNumId="0" w15:restartNumberingAfterBreak="0">
+    <w:nsid w:val="12102C44"/>
+    <w:multiLevelType w:val="hybridMultilevel"/>
+    <w:tmpl w:val="E0F476E2"/>
+    <w:lvl w:ilvl="0" w:tplc="240A0001">
+      <w:start w:val="1"/>
+      <w:numFmt w:val="bullet"/>
+      <w:lvlText w:val=""/>
+      <w:lvlJc w:val="left"/>
+      <w:pPr>
+        <w:ind w:left="720" w:hanging="360"/>
+      </w:pPr>
+      <w:rPr>
+        <w:rFonts w:ascii="Symbol" w:hAnsi="Symbol" w:hint="default"/>
+      </w:rPr>
+    </w:lvl>
+    <w:lvl w:ilvl="1" w:tplc="240A0003" w:tentative="1">
+      <w:start w:val="1"/>
+      <w:numFmt w:val="bullet"/>
+      <w:lvlText w:val="o"/>
+      <w:lvlJc w:val="left"/>
+      <w:pPr>
+        <w:ind w:left="1440" w:hanging="360"/>
+      </w:pPr>
+      <w:rPr>
+        <w:rFonts w:ascii="Courier New" w:hAnsi="Courier New" w:cs="Courier New" w:hint="default"/>
+      </w:rPr>
+    </w:lvl>
+    <w:lvl w:ilvl="2" w:tplc="240A0005" w:tentative="1">
+      <w:start w:val="1"/>
+      <w:numFmt w:val="bullet"/>
+      <w:lvlText w:val=""/>
+      <w:lvlJc w:val="left"/>
+      <w:pPr>
+        <w:ind w:left="2160" w:hanging="360"/>
+      </w:pPr>
+      <w:rPr>
+        <w:rFonts w:ascii="Wingdings" w:hAnsi="Wingdings" w:hint="default"/>
+      </w:rPr>
+    </w:lvl>
+    <w:lvl w:ilvl="3" w:tplc="240A0001" w:tentative="1">
+      <w:start w:val="1"/>
+      <w:numFmt w:val="bullet"/>
+      <w:lvlText w:val=""/>
+      <w:lvlJc w:val="left"/>
+      <w:pPr>
+        <w:ind w:left="2880" w:hanging="360"/>
+      </w:pPr>
+      <w:rPr>
+        <w:rFonts w:ascii="Symbol" w:hAnsi="Symbol" w:hint="default"/>
+      </w:rPr>
+    </w:lvl>
+    <w:lvl w:ilvl="4" w:tplc="240A0003" w:tentative="1">
+      <w:start w:val="1"/>
+      <w:numFmt w:val="bullet"/>
+      <w:lvlText w:val="o"/>
+      <w:lvlJc w:val="left"/>
+      <w:pPr>
+        <w:ind w:left="3600" w:hanging="360"/>
+      </w:pPr>
+      <w:rPr>
+        <w:rFonts w:ascii="Courier New" w:hAnsi="Courier New" w:cs="Courier New" w:hint="default"/>
+      </w:rPr>
+    </w:lvl>
+    <w:lvl w:ilvl="5" w:tplc="240A0005" w:tentative="1">
+      <w:start w:val="1"/>
+      <w:numFmt w:val="bullet"/>
+      <w:lvlText w:val=""/>
+      <w:lvlJc w:val="left"/>
+      <w:pPr>
+        <w:ind w:left="4320" w:hanging="360"/>
+      </w:pPr>
+      <w:rPr>
+        <w:rFonts w:ascii="Wingdings" w:hAnsi="Wingdings" w:hint="default"/>
+      </w:rPr>
+    </w:lvl>
+    <w:lvl w:ilvl="6" w:tplc="240A0001" w:tentative="1">
+      <w:start w:val="1"/>
+      <w:numFmt w:val="bullet"/>
+      <w:lvlText w:val=""/>
+      <w:lvlJc w:val="left"/>
+      <w:pPr>
+        <w:ind w:left="5040" w:hanging="360"/>
+      </w:pPr>
+      <w:rPr>
+        <w:rFonts w:ascii="Symbol" w:hAnsi="Symbol" w:hint="default"/>
+      </w:rPr>
+    </w:lvl>
+    <w:lvl w:ilvl="7" w:tplc="240A0003" w:tentative="1">
+      <w:start w:val="1"/>
+      <w:numFmt w:val="bullet"/>
+      <w:lvlText w:val="o"/>
+      <w:lvlJc w:val="left"/>
+      <w:pPr>
+        <w:ind w:left="5760" w:hanging="360"/>
+      </w:pPr>
+      <w:rPr>
+        <w:rFonts w:ascii="Courier New" w:hAnsi="Courier New" w:cs="Courier New" w:hint="default"/>
+      </w:rPr>
+    </w:lvl>
+    <w:lvl w:ilvl="8" w:tplc="240A0005" w:tentative="1">
+      <w:start w:val="1"/>
+      <w:numFmt w:val="bullet"/>
+      <w:lvlText w:val=""/>
+      <w:lvlJc w:val="left"/>
+      <w:pPr>
+        <w:ind w:left="6480" w:hanging="360"/>
+      </w:pPr>
+      <w:rPr>
+        <w:rFonts w:ascii="Wingdings" w:hAnsi="Wingdings" w:hint="default"/>
+      </w:rPr>
+    </w:lvl>
+  </w:abstractNum>
+  <w:abstractNum w:abstractNumId="1" w15:restartNumberingAfterBreak="0">
     <w:nsid w:val="1DDC37C2"/>
     <w:multiLevelType w:val="hybridMultilevel"/>
     <w:tmpl w:val="85E2BEE2"/>
@@ -2226,7 +3463,7 @@
       </w:pPr>
     </w:lvl>
   </w:abstractNum>
-  <w:abstractNum w:abstractNumId="1" w15:restartNumberingAfterBreak="0">
+  <w:abstractNum w:abstractNumId="2" w15:restartNumberingAfterBreak="0">
     <w:nsid w:val="1E846771"/>
     <w:multiLevelType w:val="hybridMultilevel"/>
     <w:tmpl w:val="3014EA9E"/>
@@ -2315,7 +3552,7 @@
       </w:pPr>
     </w:lvl>
   </w:abstractNum>
-  <w:abstractNum w:abstractNumId="2" w15:restartNumberingAfterBreak="0">
+  <w:abstractNum w:abstractNumId="3" w15:restartNumberingAfterBreak="0">
     <w:nsid w:val="25236F2E"/>
     <w:multiLevelType w:val="hybridMultilevel"/>
     <w:tmpl w:val="C9207346"/>
@@ -2428,7 +3665,7 @@
       </w:rPr>
     </w:lvl>
   </w:abstractNum>
-  <w:abstractNum w:abstractNumId="3" w15:restartNumberingAfterBreak="0">
+  <w:abstractNum w:abstractNumId="4" w15:restartNumberingAfterBreak="0">
     <w:nsid w:val="254F6EB4"/>
     <w:multiLevelType w:val="hybridMultilevel"/>
     <w:tmpl w:val="5CB024B4"/>
@@ -2514,7 +3751,7 @@
       </w:pPr>
     </w:lvl>
   </w:abstractNum>
-  <w:abstractNum w:abstractNumId="4" w15:restartNumberingAfterBreak="0">
+  <w:abstractNum w:abstractNumId="5" w15:restartNumberingAfterBreak="0">
     <w:nsid w:val="39C27EF8"/>
     <w:multiLevelType w:val="hybridMultilevel"/>
     <w:tmpl w:val="3B84B100"/>
@@ -2603,7 +3840,7 @@
       </w:pPr>
     </w:lvl>
   </w:abstractNum>
-  <w:abstractNum w:abstractNumId="5" w15:restartNumberingAfterBreak="0">
+  <w:abstractNum w:abstractNumId="6" w15:restartNumberingAfterBreak="0">
     <w:nsid w:val="43875D06"/>
     <w:multiLevelType w:val="hybridMultilevel"/>
     <w:tmpl w:val="D80E3108"/>
@@ -2716,7 +3953,7 @@
       </w:rPr>
     </w:lvl>
   </w:abstractNum>
-  <w:abstractNum w:abstractNumId="6" w15:restartNumberingAfterBreak="0">
+  <w:abstractNum w:abstractNumId="7" w15:restartNumberingAfterBreak="0">
     <w:nsid w:val="44040836"/>
     <w:multiLevelType w:val="hybridMultilevel"/>
     <w:tmpl w:val="172C6328"/>
@@ -2802,7 +4039,7 @@
       </w:pPr>
     </w:lvl>
   </w:abstractNum>
-  <w:abstractNum w:abstractNumId="7" w15:restartNumberingAfterBreak="0">
+  <w:abstractNum w:abstractNumId="8" w15:restartNumberingAfterBreak="0">
     <w:nsid w:val="45DE061D"/>
     <w:multiLevelType w:val="hybridMultilevel"/>
     <w:tmpl w:val="6DDE6028"/>
@@ -2888,7 +4125,7 @@
       </w:pPr>
     </w:lvl>
   </w:abstractNum>
-  <w:abstractNum w:abstractNumId="8" w15:restartNumberingAfterBreak="0">
+  <w:abstractNum w:abstractNumId="9" w15:restartNumberingAfterBreak="0">
     <w:nsid w:val="5BA17427"/>
     <w:multiLevelType w:val="hybridMultilevel"/>
     <w:tmpl w:val="E84C35DC"/>
@@ -2979,7 +4216,7 @@
       </w:pPr>
     </w:lvl>
   </w:abstractNum>
-  <w:abstractNum w:abstractNumId="9" w15:restartNumberingAfterBreak="0">
+  <w:abstractNum w:abstractNumId="10" w15:restartNumberingAfterBreak="0">
     <w:nsid w:val="6D244A83"/>
     <w:multiLevelType w:val="hybridMultilevel"/>
     <w:tmpl w:val="8A486352"/>
@@ -3066,34 +4303,37 @@
     </w:lvl>
   </w:abstractNum>
   <w:num w:numId="1" w16cid:durableId="543912516">
+    <w:abstractNumId w:val="10"/>
+  </w:num>
+  <w:num w:numId="2" w16cid:durableId="78328212">
+    <w:abstractNumId w:val="1"/>
+  </w:num>
+  <w:num w:numId="3" w16cid:durableId="437995124">
+    <w:abstractNumId w:val="2"/>
+  </w:num>
+  <w:num w:numId="4" w16cid:durableId="1214807643">
+    <w:abstractNumId w:val="7"/>
+  </w:num>
+  <w:num w:numId="5" w16cid:durableId="940918886">
+    <w:abstractNumId w:val="5"/>
+  </w:num>
+  <w:num w:numId="6" w16cid:durableId="1364863844">
+    <w:abstractNumId w:val="6"/>
+  </w:num>
+  <w:num w:numId="7" w16cid:durableId="1752921476">
+    <w:abstractNumId w:val="3"/>
+  </w:num>
+  <w:num w:numId="8" w16cid:durableId="174881650">
     <w:abstractNumId w:val="9"/>
   </w:num>
-  <w:num w:numId="2" w16cid:durableId="78328212">
-    <w:abstractNumId w:val="0"/>
-  </w:num>
-  <w:num w:numId="3" w16cid:durableId="437995124">
-    <w:abstractNumId w:val="1"/>
-  </w:num>
-  <w:num w:numId="4" w16cid:durableId="1214807643">
-    <w:abstractNumId w:val="6"/>
-  </w:num>
-  <w:num w:numId="5" w16cid:durableId="940918886">
+  <w:num w:numId="9" w16cid:durableId="187790868">
     <w:abstractNumId w:val="4"/>
   </w:num>
-  <w:num w:numId="6" w16cid:durableId="1364863844">
-    <w:abstractNumId w:val="5"/>
-  </w:num>
-  <w:num w:numId="7" w16cid:durableId="1752921476">
-    <w:abstractNumId w:val="2"/>
-  </w:num>
-  <w:num w:numId="8" w16cid:durableId="174881650">
+  <w:num w:numId="10" w16cid:durableId="1152142178">
     <w:abstractNumId w:val="8"/>
   </w:num>
-  <w:num w:numId="9" w16cid:durableId="187790868">
-    <w:abstractNumId w:val="3"/>
-  </w:num>
-  <w:num w:numId="10" w16cid:durableId="1152142178">
-    <w:abstractNumId w:val="7"/>
+  <w:num w:numId="11" w16cid:durableId="1445996112">
+    <w:abstractNumId w:val="0"/>
   </w:num>
 </w:numbering>
 </file>
@@ -3557,7 +4797,6 @@
   <w:style w:type="character" w:default="1" w:styleId="Fuentedeprrafopredeter">
     <w:name w:val="Default Paragraph Font"/>
     <w:uiPriority w:val="1"/>
-    <w:semiHidden/>
     <w:unhideWhenUsed/>
   </w:style>
   <w:style w:type="table" w:default="1" w:styleId="Tablanormal">

</xml_diff>